<commit_message>
Replace Think-Aloud sheets with TAM forms
</commit_message>
<xml_diff>
--- a/after_data/P10/P01_2.1_Post_Task_Interview_and_Quick_Evaluation_Sheet.docx
+++ b/after_data/P10/P01_2.1_Post_Task_Interview_and_Quick_Evaluation_Sheet.docx
@@ -1,10 +1,10 @@
 
 <file path=word/document.xml><?xml version="1.0" encoding="utf-8"?>
-<w:document xmlns:wpc="http://schemas.microsoft.com/office/word/2010/wordprocessingCanvas" xmlns:cx="http://schemas.microsoft.com/office/drawing/2014/chartex" xmlns:cx1="http://schemas.microsoft.com/office/drawing/2015/9/8/chartex" xmlns:cx2="http://schemas.microsoft.com/office/drawing/2015/10/21/chartex" xmlns:cx3="http://schemas.microsoft.com/office/drawing/2016/5/9/chartex" xmlns:cx4="http://schemas.microsoft.com/office/drawing/2016/5/10/chartex" xmlns:cx5="http://schemas.microsoft.com/office/drawing/2016/5/11/chartex" xmlns:cx6="http://schemas.microsoft.com/office/drawing/2016/5/12/chartex" xmlns:cx7="http://schemas.microsoft.com/office/drawing/2016/5/13/chartex" xmlns:cx8="http://schemas.microsoft.com/office/drawing/2016/5/14/chartex" xmlns:mc="http://schemas.openxmlformats.org/markup-compatibility/2006" xmlns:aink="http://schemas.microsoft.com/office/drawing/2016/ink" xmlns:am3d="http://schemas.microsoft.com/office/drawing/2017/model3d" xmlns:o="urn:schemas-microsoft-com:office:office" xmlns:oel="http://schemas.microsoft.com/office/2019/extlst" xmlns:r="http://schemas.openxmlformats.org/officeDocument/2006/relationships" xmlns:m="http://schemas.openxmlformats.org/officeDocument/2006/math" xmlns:v="urn:schemas-microsoft-com:vml" xmlns:wp14="http://schemas.microsoft.com/office/word/2010/wordprocessingDrawing" xmlns:wp="http://schemas.openxmlformats.org/drawingml/2006/wordprocessingDrawing" xmlns:w10="urn:schemas-microsoft-com:office:word" xmlns:w="http://schemas.openxmlformats.org/wordprocessingml/2006/main" xmlns:w14="http://schemas.microsoft.com/office/word/2010/wordml" xmlns:w15="http://schemas.microsoft.com/office/word/2012/wordml" xmlns:w16cex="http://schemas.microsoft.com/office/word/2018/wordml/cex" xmlns:w16cid="http://schemas.microsoft.com/office/word/2016/wordml/cid" xmlns:w16="http://schemas.microsoft.com/office/word/2018/wordml" xmlns:w16du="http://schemas.microsoft.com/office/word/2023/wordml/word16du" xmlns:w16sdtdh="http://schemas.microsoft.com/office/word/2020/wordml/sdtdatahash" xmlns:w16sdtfl="http://schemas.microsoft.com/office/word/2024/wordml/sdtformatlock" xmlns:w16se="http://schemas.microsoft.com/office/word/2015/wordml/symex" xmlns:wpg="http://schemas.microsoft.com/office/word/2010/wordprocessingGroup" xmlns:wpi="http://schemas.microsoft.com/office/word/2010/wordprocessingInk" xmlns:wne="http://schemas.microsoft.com/office/word/2006/wordml" xmlns:wps="http://schemas.microsoft.com/office/word/2010/wordprocessingShape" mc:Ignorable="w14 w15 w16se w16cid w16 w16cex w16sdtdh w16sdtfl w16du wp14">
+<w:document xmlns:wpc="http://schemas.microsoft.com/office/word/2010/wordprocessingCanvas" xmlns:cx="http://schemas.microsoft.com/office/drawing/2014/chartex" xmlns:cx1="http://schemas.microsoft.com/office/drawing/2015/9/8/chartex" xmlns:cx2="http://schemas.microsoft.com/office/drawing/2015/10/21/chartex" xmlns:cx3="http://schemas.microsoft.com/office/drawing/2016/5/9/chartex" xmlns:cx4="http://schemas.microsoft.com/office/drawing/2016/5/10/chartex" xmlns:cx5="http://schemas.microsoft.com/office/drawing/2016/5/11/chartex" xmlns:cx6="http://schemas.microsoft.com/office/drawing/2016/5/12/chartex" xmlns:cx7="http://schemas.microsoft.com/office/drawing/2016/5/13/chartex" xmlns:cx8="http://schemas.microsoft.com/office/drawing/2016/5/14/chartex" xmlns:mc="http://schemas.openxmlformats.org/markup-compatibility/2006" xmlns:aink="http://schemas.microsoft.com/office/drawing/2016/ink" xmlns:am3d="http://schemas.microsoft.com/office/drawing/2017/model3d" xmlns:o="urn:schemas-microsoft-com:office:office" xmlns:oel="http://schemas.microsoft.com/office/2019/extlst" xmlns:r="http://schemas.openxmlformats.org/officeDocument/2006/relationships" xmlns:m="http://schemas.openxmlformats.org/officeDocument/2006/math" xmlns:v="urn:schemas-microsoft-com:vml" xmlns:wp14="http://schemas.microsoft.com/office/word/2010/wordprocessingDrawing" xmlns:wp="http://schemas.openxmlformats.org/drawingml/2006/wordprocessingDrawing" xmlns:w10="urn:schemas-microsoft-com:office:word" xmlns:w="http://schemas.openxmlformats.org/wordprocessingml/2006/main" xmlns:w14="http://schemas.microsoft.com/office/word/2010/wordml" xmlns:w15="http://schemas.microsoft.com/office/word/2012/wordml" xmlns:w16cex="http://schemas.microsoft.com/office/word/2018/wordml/cex" xmlns:w16cid="http://schemas.microsoft.com/office/word/2016/wordml/cid" xmlns:w16="http://schemas.microsoft.com/office/word/2018/wordml" xmlns:w16sdtdh="http://schemas.microsoft.com/office/word/2020/wordml/sdtdatahash" xmlns:w16se="http://schemas.microsoft.com/office/word/2015/wordml/symex" xmlns:wpg="http://schemas.microsoft.com/office/word/2010/wordprocessingGroup" xmlns:wpi="http://schemas.microsoft.com/office/word/2010/wordprocessingInk" xmlns:wne="http://schemas.microsoft.com/office/word/2006/wordml" xmlns:wps="http://schemas.microsoft.com/office/word/2010/wordprocessingShape" mc:Ignorable="w14 w15 w16se w16cid w16 w16cex w16sdtdh wp14">
   <w:body>
     <w:p>
       <w:pPr>
-        <w:pStyle w:val="Title"/>
+        <w:pStyle w:val="af2"/>
       </w:pPr>
       <w:r>
         <w:t>Post-Task Interview &amp; Quick Evaluation Sheet</w:t>
@@ -16,12 +16,44 @@
           <w:i/>
           <w:sz w:val="20"/>
         </w:rPr>
-        <w:t>Participant: KWongYin Tang | Moderator: Houshi Ye | Date / participant ID: not recorded. Answers below paraphrase the interview; timestamps identify the evidence.</w:t>
+        <w:t xml:space="preserve">Participant: </w:t>
+      </w:r>
+      <w:proofErr w:type="spellStart"/>
+      <w:r>
+        <w:rPr>
+          <w:i/>
+          <w:sz w:val="20"/>
+        </w:rPr>
+        <w:t>KWongYin</w:t>
+      </w:r>
+      <w:proofErr w:type="spellEnd"/>
+      <w:r>
+        <w:rPr>
+          <w:i/>
+          <w:sz w:val="20"/>
+        </w:rPr>
+        <w:t xml:space="preserve"> Tang | Moderator: </w:t>
+      </w:r>
+      <w:proofErr w:type="spellStart"/>
+      <w:r>
+        <w:rPr>
+          <w:i/>
+          <w:sz w:val="20"/>
+        </w:rPr>
+        <w:t>Houshi</w:t>
+      </w:r>
+      <w:proofErr w:type="spellEnd"/>
+      <w:r>
+        <w:rPr>
+          <w:i/>
+          <w:sz w:val="20"/>
+        </w:rPr>
+        <w:t xml:space="preserve"> Ye | Date / participant ID: not recorded. Answers below paraphrase the interview; timestamps identify the evidence.</w:t>
       </w:r>
     </w:p>
     <w:p>
       <w:pPr>
-        <w:pStyle w:val="Heading1"/>
+        <w:pStyle w:val="1"/>
       </w:pPr>
       <w:r>
         <w:t>A. Immediate post-task ratings</w:t>
@@ -34,7 +66,7 @@
     </w:p>
     <w:tbl>
       <w:tblPr>
-        <w:tblStyle w:val="TableGrid"/>
+        <w:tblStyle w:val="af4"/>
         <w:tblW w:w="0" w:type="auto"/>
         <w:jc w:val="center"/>
         <w:tblLook w:val="04A0" w:firstRow="1" w:lastRow="0" w:firstColumn="1" w:lastColumn="0" w:noHBand="0" w:noVBand="1"/>
@@ -140,7 +172,7 @@
           <w:p>
             <w:r>
               <w:rPr>
-                <w:rFonts w:eastAsia="SimSun" w:hint="eastAsia"/>
+                <w:rFonts w:eastAsia="宋体" w:hint="eastAsia"/>
                 <w:sz w:val="18"/>
                 <w:lang w:eastAsia="zh-CN"/>
               </w:rPr>
@@ -195,7 +227,7 @@
           <w:p>
             <w:r>
               <w:rPr>
-                <w:rFonts w:eastAsia="SimSun" w:hint="eastAsia"/>
+                <w:rFonts w:eastAsia="宋体" w:hint="eastAsia"/>
                 <w:sz w:val="18"/>
                 <w:lang w:eastAsia="zh-CN"/>
               </w:rPr>
@@ -250,7 +282,7 @@
           <w:p>
             <w:r>
               <w:rPr>
-                <w:rFonts w:eastAsia="SimSun" w:hint="eastAsia"/>
+                <w:rFonts w:eastAsia="宋体" w:hint="eastAsia"/>
                 <w:sz w:val="18"/>
                 <w:lang w:eastAsia="zh-CN"/>
               </w:rPr>
@@ -305,7 +337,7 @@
           <w:p>
             <w:r>
               <w:rPr>
-                <w:rFonts w:eastAsia="SimSun" w:hint="eastAsia"/>
+                <w:rFonts w:eastAsia="宋体" w:hint="eastAsia"/>
                 <w:sz w:val="18"/>
                 <w:lang w:eastAsia="zh-CN"/>
               </w:rPr>
@@ -323,7 +355,7 @@
     </w:tbl>
     <w:p>
       <w:pPr>
-        <w:pStyle w:val="Heading1"/>
+        <w:pStyle w:val="1"/>
       </w:pPr>
       <w:r>
         <w:t>B. Decision confidence</w:t>
@@ -335,13 +367,26 @@
       </w:r>
     </w:p>
     <w:p>
+      <w:pPr>
+        <w:rPr>
+          <w:rFonts w:hint="eastAsia"/>
+          <w:lang w:eastAsia="zh-CN"/>
+        </w:rPr>
+      </w:pPr>
       <w:r>
-        <w:t>1 = Not confident at all; 5 = Very confident. Response: not recorded.</w:t>
+        <w:t xml:space="preserve">1 = Not confident at all; 5 = Very confident. Response: </w:t>
+      </w:r>
+      <w:r>
+        <w:rPr>
+          <w:rFonts w:hint="eastAsia"/>
+          <w:lang w:eastAsia="zh-CN"/>
+        </w:rPr>
+        <w:t>4</w:t>
       </w:r>
     </w:p>
     <w:p>
       <w:pPr>
-        <w:pStyle w:val="Heading1"/>
+        <w:pStyle w:val="1"/>
       </w:pPr>
       <w:r>
         <w:t>C. Short answers</w:t>
@@ -422,7 +467,7 @@
     </w:p>
     <w:p>
       <w:pPr>
-        <w:pStyle w:val="Heading1"/>
+        <w:pStyle w:val="1"/>
       </w:pPr>
       <w:r>
         <w:t>D. When is this support useful? (Select all that apply)</w:t>
@@ -430,7 +475,7 @@
     </w:p>
     <w:p>
       <w:pPr>
-        <w:pStyle w:val="ListBullet"/>
+        <w:pStyle w:val="a0"/>
       </w:pPr>
       <w:r>
         <w:t>☒ Early service — may require arriving at the stop earlier (05:06).</w:t>
@@ -438,7 +483,7 @@
     </w:p>
     <w:p>
       <w:pPr>
-        <w:pStyle w:val="ListBullet"/>
+        <w:pStyle w:val="a0"/>
       </w:pPr>
       <w:r>
         <w:t>☒ Delayed service — explicitly considered important (05:06-05:26).</w:t>
@@ -446,7 +491,7 @@
     </w:p>
     <w:p>
       <w:pPr>
-        <w:pStyle w:val="ListBullet"/>
+        <w:pStyle w:val="a0"/>
       </w:pPr>
       <w:r>
         <w:t>☒ Cancelled or changed service — cancellation supported; changed service not separately confirmed (05:06).</w:t>
@@ -454,7 +499,7 @@
     </w:p>
     <w:p>
       <w:pPr>
-        <w:pStyle w:val="ListBullet"/>
+        <w:pStyle w:val="a0"/>
       </w:pPr>
       <w:r>
         <w:t>☐ On-time service — described as not very important for this support (05:06).</w:t>
@@ -462,7 +507,7 @@
     </w:p>
     <w:p>
       <w:pPr>
-        <w:pStyle w:val="ListBullet"/>
+        <w:pStyle w:val="a0"/>
       </w:pPr>
       <w:r>
         <w:t>☒ Other: risk of arriving late for an appointment or missing the last connecting bus (00:41; 02:38-02:55).</w:t>
@@ -470,7 +515,7 @@
     </w:p>
     <w:p>
       <w:pPr>
-        <w:pStyle w:val="Heading1"/>
+        <w:pStyle w:val="1"/>
       </w:pPr>
       <w:r>
         <w:t>E. Moderator follow-up prompts</w:t>
@@ -478,15 +523,23 @@
     </w:p>
     <w:p>
       <w:pPr>
-        <w:pStyle w:val="ListBullet"/>
+        <w:pStyle w:val="a0"/>
       </w:pPr>
       <w:r>
-        <w:t>1. Certainty: wants available options, their pros and cons, estimated delay, connection consequences and reliable current information. A change in confidence was not explicitly rated (01:18-01:36; 02:04-02:55; 05:43).</w:t>
+        <w:t xml:space="preserve">1. Certainty: wants available options, their </w:t>
+      </w:r>
+      <w:proofErr w:type="gramStart"/>
+      <w:r>
+        <w:t>pros</w:t>
+      </w:r>
+      <w:proofErr w:type="gramEnd"/>
+      <w:r>
+        <w:t xml:space="preserve"> and cons, estimated delay, connection consequences and reliable current information. A change in confidence was not explicitly rated (01:18-01:36; 02:04-02:55; 05:43).</w:t>
       </w:r>
     </w:p>
     <w:p>
       <w:pPr>
-        <w:pStyle w:val="ListBullet"/>
+        <w:pStyle w:val="a0"/>
       </w:pPr>
       <w:r>
         <w:t>2. Need to change: first check whether the current journey still reaches the next appointment on time. If yes, stay; if no, compare alternatives by arrival time and journey simplicity / transfers (03:12-03:40).</w:t>
@@ -494,7 +547,7 @@
     </w:p>
     <w:p>
       <w:pPr>
-        <w:pStyle w:val="ListBullet"/>
+        <w:pStyle w:val="a0"/>
       </w:pPr>
       <w:r>
         <w:t>3. Ignored information: no observed instance recorded. The participant did not want repeated traffic-jam messages unless they indicated likely lateness for the next appointment (00:41).</w:t>
@@ -502,7 +555,7 @@
     </w:p>
     <w:p>
       <w:pPr>
-        <w:pStyle w:val="ListBullet"/>
+        <w:pStyle w:val="a0"/>
       </w:pPr>
       <w:r>
         <w:t>4. Normal service: on-time decision support is less important; support should appear when the person anticipates being late (04:11; 05:06).</w:t>
@@ -510,10 +563,10 @@
     </w:p>
     <w:p>
       <w:pPr>
-        <w:pStyle w:val="Heading1"/>
+        <w:pStyle w:val="1"/>
         <w:pageBreakBefore/>
         <w:rPr>
-          <w:rFonts w:eastAsia="SimSun" w:hint="eastAsia"/>
+          <w:rFonts w:eastAsia="宋体"/>
           <w:lang w:eastAsia="zh-CN"/>
         </w:rPr>
       </w:pPr>
@@ -523,14 +576,14 @@
       </w:r>
       <w:r>
         <w:rPr>
-          <w:rFonts w:ascii="SimSun" w:eastAsia="SimSun" w:hAnsi="SimSun" w:hint="eastAsia"/>
+          <w:rFonts w:ascii="宋体" w:eastAsia="宋体" w:hAnsi="宋体" w:hint="eastAsia"/>
           <w:lang w:eastAsia="zh-CN"/>
         </w:rPr>
         <w:t>P</w:t>
       </w:r>
       <w:r>
         <w:rPr>
-          <w:rFonts w:eastAsia="SimSun" w:hint="eastAsia"/>
+          <w:rFonts w:eastAsia="宋体" w:hint="eastAsia"/>
           <w:lang w:eastAsia="zh-CN"/>
         </w:rPr>
         <w:t>01</w:t>
@@ -543,7 +596,15 @@
     </w:p>
     <w:p>
       <w:r>
-        <w:t>Information before acting: available options and the pros and cons of each are central to deciding how to get to the destination (01:18-01:36).</w:t>
+        <w:t xml:space="preserve">Information before </w:t>
+      </w:r>
+      <w:proofErr w:type="gramStart"/>
+      <w:r>
+        <w:t>acting:</w:t>
+      </w:r>
+      <w:proofErr w:type="gramEnd"/>
+      <w:r>
+        <w:t xml:space="preserve"> available options and the pros and cons of each are central to deciding how to get to the destination (01:18-01:36).</w:t>
       </w:r>
     </w:p>
     <w:p>
@@ -558,7 +619,15 @@
     </w:p>
     <w:p>
       <w:r>
-        <w:t>Useful conditions: early, delayed and cancelled service are explicitly supported. Early arrival matters because the passenger may need to reach the stop sooner (04:44-05:26).</w:t>
+        <w:t xml:space="preserve">Useful conditions: early, </w:t>
+      </w:r>
+      <w:proofErr w:type="gramStart"/>
+      <w:r>
+        <w:t>delayed</w:t>
+      </w:r>
+      <w:proofErr w:type="gramEnd"/>
+      <w:r>
+        <w:t xml:space="preserve"> and cancelled service are explicitly supported. Early arrival matters because the passenger may need to reach the stop sooner (04:44-05:26).</w:t>
       </w:r>
     </w:p>
     <w:p>
@@ -573,7 +642,15 @@
     </w:p>
     <w:p>
       <w:r>
-        <w:t>Prototype fit: communication felt more human-like. Requested simpler journey selection, side-by-side comparison, contextual explanations and possible voice interaction (07:05-08:31).</w:t>
+        <w:t xml:space="preserve">Prototype fit: communication felt more human-like. Requested simpler journey selection, side-by-side comparison, contextual </w:t>
+      </w:r>
+      <w:proofErr w:type="gramStart"/>
+      <w:r>
+        <w:t>explanations</w:t>
+      </w:r>
+      <w:proofErr w:type="gramEnd"/>
+      <w:r>
+        <w:t xml:space="preserve"> and possible voice interaction (07:05-08:31).</w:t>
       </w:r>
     </w:p>
     <w:p>
@@ -593,7 +670,7 @@
 </file>
 
 <file path=word/endnotes.xml><?xml version="1.0" encoding="utf-8"?>
-<w:endnotes xmlns:wpc="http://schemas.microsoft.com/office/word/2010/wordprocessingCanvas" xmlns:cx="http://schemas.microsoft.com/office/drawing/2014/chartex" xmlns:cx1="http://schemas.microsoft.com/office/drawing/2015/9/8/chartex" xmlns:cx2="http://schemas.microsoft.com/office/drawing/2015/10/21/chartex" xmlns:cx3="http://schemas.microsoft.com/office/drawing/2016/5/9/chartex" xmlns:cx4="http://schemas.microsoft.com/office/drawing/2016/5/10/chartex" xmlns:cx5="http://schemas.microsoft.com/office/drawing/2016/5/11/chartex" xmlns:cx6="http://schemas.microsoft.com/office/drawing/2016/5/12/chartex" xmlns:cx7="http://schemas.microsoft.com/office/drawing/2016/5/13/chartex" xmlns:cx8="http://schemas.microsoft.com/office/drawing/2016/5/14/chartex" xmlns:mc="http://schemas.openxmlformats.org/markup-compatibility/2006" xmlns:aink="http://schemas.microsoft.com/office/drawing/2016/ink" xmlns:am3d="http://schemas.microsoft.com/office/drawing/2017/model3d" xmlns:o="urn:schemas-microsoft-com:office:office" xmlns:oel="http://schemas.microsoft.com/office/2019/extlst" xmlns:r="http://schemas.openxmlformats.org/officeDocument/2006/relationships" xmlns:m="http://schemas.openxmlformats.org/officeDocument/2006/math" xmlns:v="urn:schemas-microsoft-com:vml" xmlns:wp14="http://schemas.microsoft.com/office/word/2010/wordprocessingDrawing" xmlns:wp="http://schemas.openxmlformats.org/drawingml/2006/wordprocessingDrawing" xmlns:w10="urn:schemas-microsoft-com:office:word" xmlns:w="http://schemas.openxmlformats.org/wordprocessingml/2006/main" xmlns:w14="http://schemas.microsoft.com/office/word/2010/wordml" xmlns:w15="http://schemas.microsoft.com/office/word/2012/wordml" xmlns:w16cex="http://schemas.microsoft.com/office/word/2018/wordml/cex" xmlns:w16cid="http://schemas.microsoft.com/office/word/2016/wordml/cid" xmlns:w16="http://schemas.microsoft.com/office/word/2018/wordml" xmlns:w16du="http://schemas.microsoft.com/office/word/2023/wordml/word16du" xmlns:w16sdtdh="http://schemas.microsoft.com/office/word/2020/wordml/sdtdatahash" xmlns:w16sdtfl="http://schemas.microsoft.com/office/word/2024/wordml/sdtformatlock" xmlns:w16se="http://schemas.microsoft.com/office/word/2015/wordml/symex" xmlns:wpg="http://schemas.microsoft.com/office/word/2010/wordprocessingGroup" xmlns:wpi="http://schemas.microsoft.com/office/word/2010/wordprocessingInk" xmlns:wne="http://schemas.microsoft.com/office/word/2006/wordml" xmlns:wps="http://schemas.microsoft.com/office/word/2010/wordprocessingShape" mc:Ignorable="w14 w15 w16se w16cid w16 w16cex w16sdtdh w16sdtfl w16du wp14">
+<w:endnotes xmlns:wpc="http://schemas.microsoft.com/office/word/2010/wordprocessingCanvas" xmlns:cx="http://schemas.microsoft.com/office/drawing/2014/chartex" xmlns:cx1="http://schemas.microsoft.com/office/drawing/2015/9/8/chartex" xmlns:cx2="http://schemas.microsoft.com/office/drawing/2015/10/21/chartex" xmlns:cx3="http://schemas.microsoft.com/office/drawing/2016/5/9/chartex" xmlns:cx4="http://schemas.microsoft.com/office/drawing/2016/5/10/chartex" xmlns:cx5="http://schemas.microsoft.com/office/drawing/2016/5/11/chartex" xmlns:cx6="http://schemas.microsoft.com/office/drawing/2016/5/12/chartex" xmlns:cx7="http://schemas.microsoft.com/office/drawing/2016/5/13/chartex" xmlns:cx8="http://schemas.microsoft.com/office/drawing/2016/5/14/chartex" xmlns:mc="http://schemas.openxmlformats.org/markup-compatibility/2006" xmlns:aink="http://schemas.microsoft.com/office/drawing/2016/ink" xmlns:am3d="http://schemas.microsoft.com/office/drawing/2017/model3d" xmlns:o="urn:schemas-microsoft-com:office:office" xmlns:oel="http://schemas.microsoft.com/office/2019/extlst" xmlns:r="http://schemas.openxmlformats.org/officeDocument/2006/relationships" xmlns:m="http://schemas.openxmlformats.org/officeDocument/2006/math" xmlns:v="urn:schemas-microsoft-com:vml" xmlns:wp14="http://schemas.microsoft.com/office/word/2010/wordprocessingDrawing" xmlns:wp="http://schemas.openxmlformats.org/drawingml/2006/wordprocessingDrawing" xmlns:w10="urn:schemas-microsoft-com:office:word" xmlns:w="http://schemas.openxmlformats.org/wordprocessingml/2006/main" xmlns:w14="http://schemas.microsoft.com/office/word/2010/wordml" xmlns:w15="http://schemas.microsoft.com/office/word/2012/wordml" xmlns:w16cex="http://schemas.microsoft.com/office/word/2018/wordml/cex" xmlns:w16cid="http://schemas.microsoft.com/office/word/2016/wordml/cid" xmlns:w16="http://schemas.microsoft.com/office/word/2018/wordml" xmlns:w16sdtdh="http://schemas.microsoft.com/office/word/2020/wordml/sdtdatahash" xmlns:w16se="http://schemas.microsoft.com/office/word/2015/wordml/symex" xmlns:wpg="http://schemas.microsoft.com/office/word/2010/wordprocessingGroup" xmlns:wpi="http://schemas.microsoft.com/office/word/2010/wordprocessingInk" xmlns:wne="http://schemas.microsoft.com/office/word/2006/wordml" xmlns:wps="http://schemas.microsoft.com/office/word/2010/wordprocessingShape" mc:Ignorable="w14 w15 w16se w16cid w16 w16cex w16sdtdh wp14">
   <w:endnote w:type="separator" w:id="-1">
     <w:p>
       <w:pPr>
@@ -618,10 +695,10 @@
 </file>
 
 <file path=word/footer1.xml><?xml version="1.0" encoding="utf-8"?>
-<w:ftr xmlns:wpc="http://schemas.microsoft.com/office/word/2010/wordprocessingCanvas" xmlns:cx="http://schemas.microsoft.com/office/drawing/2014/chartex" xmlns:cx1="http://schemas.microsoft.com/office/drawing/2015/9/8/chartex" xmlns:cx2="http://schemas.microsoft.com/office/drawing/2015/10/21/chartex" xmlns:cx3="http://schemas.microsoft.com/office/drawing/2016/5/9/chartex" xmlns:cx4="http://schemas.microsoft.com/office/drawing/2016/5/10/chartex" xmlns:cx5="http://schemas.microsoft.com/office/drawing/2016/5/11/chartex" xmlns:cx6="http://schemas.microsoft.com/office/drawing/2016/5/12/chartex" xmlns:cx7="http://schemas.microsoft.com/office/drawing/2016/5/13/chartex" xmlns:cx8="http://schemas.microsoft.com/office/drawing/2016/5/14/chartex" xmlns:mc="http://schemas.openxmlformats.org/markup-compatibility/2006" xmlns:aink="http://schemas.microsoft.com/office/drawing/2016/ink" xmlns:am3d="http://schemas.microsoft.com/office/drawing/2017/model3d" xmlns:o="urn:schemas-microsoft-com:office:office" xmlns:oel="http://schemas.microsoft.com/office/2019/extlst" xmlns:r="http://schemas.openxmlformats.org/officeDocument/2006/relationships" xmlns:m="http://schemas.openxmlformats.org/officeDocument/2006/math" xmlns:v="urn:schemas-microsoft-com:vml" xmlns:wp14="http://schemas.microsoft.com/office/word/2010/wordprocessingDrawing" xmlns:wp="http://schemas.openxmlformats.org/drawingml/2006/wordprocessingDrawing" xmlns:w10="urn:schemas-microsoft-com:office:word" xmlns:w="http://schemas.openxmlformats.org/wordprocessingml/2006/main" xmlns:w14="http://schemas.microsoft.com/office/word/2010/wordml" xmlns:w15="http://schemas.microsoft.com/office/word/2012/wordml" xmlns:w16cex="http://schemas.microsoft.com/office/word/2018/wordml/cex" xmlns:w16cid="http://schemas.microsoft.com/office/word/2016/wordml/cid" xmlns:w16="http://schemas.microsoft.com/office/word/2018/wordml" xmlns:w16du="http://schemas.microsoft.com/office/word/2023/wordml/word16du" xmlns:w16sdtdh="http://schemas.microsoft.com/office/word/2020/wordml/sdtdatahash" xmlns:w16sdtfl="http://schemas.microsoft.com/office/word/2024/wordml/sdtformatlock" xmlns:w16se="http://schemas.microsoft.com/office/word/2015/wordml/symex" xmlns:wpg="http://schemas.microsoft.com/office/word/2010/wordprocessingGroup" xmlns:wpi="http://schemas.microsoft.com/office/word/2010/wordprocessingInk" xmlns:wne="http://schemas.microsoft.com/office/word/2006/wordml" xmlns:wps="http://schemas.microsoft.com/office/word/2010/wordprocessingShape" mc:Ignorable="w14 w15 w16se w16cid w16 w16cex w16sdtdh w16sdtfl w16du wp14">
+<w:ftr xmlns:wpc="http://schemas.microsoft.com/office/word/2010/wordprocessingCanvas" xmlns:cx="http://schemas.microsoft.com/office/drawing/2014/chartex" xmlns:cx1="http://schemas.microsoft.com/office/drawing/2015/9/8/chartex" xmlns:cx2="http://schemas.microsoft.com/office/drawing/2015/10/21/chartex" xmlns:cx3="http://schemas.microsoft.com/office/drawing/2016/5/9/chartex" xmlns:cx4="http://schemas.microsoft.com/office/drawing/2016/5/10/chartex" xmlns:cx5="http://schemas.microsoft.com/office/drawing/2016/5/11/chartex" xmlns:cx6="http://schemas.microsoft.com/office/drawing/2016/5/12/chartex" xmlns:cx7="http://schemas.microsoft.com/office/drawing/2016/5/13/chartex" xmlns:cx8="http://schemas.microsoft.com/office/drawing/2016/5/14/chartex" xmlns:mc="http://schemas.openxmlformats.org/markup-compatibility/2006" xmlns:aink="http://schemas.microsoft.com/office/drawing/2016/ink" xmlns:am3d="http://schemas.microsoft.com/office/drawing/2017/model3d" xmlns:o="urn:schemas-microsoft-com:office:office" xmlns:oel="http://schemas.microsoft.com/office/2019/extlst" xmlns:r="http://schemas.openxmlformats.org/officeDocument/2006/relationships" xmlns:m="http://schemas.openxmlformats.org/officeDocument/2006/math" xmlns:v="urn:schemas-microsoft-com:vml" xmlns:wp14="http://schemas.microsoft.com/office/word/2010/wordprocessingDrawing" xmlns:wp="http://schemas.openxmlformats.org/drawingml/2006/wordprocessingDrawing" xmlns:w10="urn:schemas-microsoft-com:office:word" xmlns:w="http://schemas.openxmlformats.org/wordprocessingml/2006/main" xmlns:w14="http://schemas.microsoft.com/office/word/2010/wordml" xmlns:w15="http://schemas.microsoft.com/office/word/2012/wordml" xmlns:w16cex="http://schemas.microsoft.com/office/word/2018/wordml/cex" xmlns:w16cid="http://schemas.microsoft.com/office/word/2016/wordml/cid" xmlns:w16="http://schemas.microsoft.com/office/word/2018/wordml" xmlns:w16sdtdh="http://schemas.microsoft.com/office/word/2020/wordml/sdtdatahash" xmlns:w16se="http://schemas.microsoft.com/office/word/2015/wordml/symex" xmlns:wpg="http://schemas.microsoft.com/office/word/2010/wordprocessingGroup" xmlns:wpi="http://schemas.microsoft.com/office/word/2010/wordprocessingInk" xmlns:wne="http://schemas.microsoft.com/office/word/2006/wordml" xmlns:wps="http://schemas.microsoft.com/office/word/2010/wordprocessingShape" mc:Ignorable="w14 w15 w16se w16cid w16 w16cex w16sdtdh wp14">
   <w:p>
     <w:pPr>
-      <w:pStyle w:val="Footer"/>
+      <w:pStyle w:val="ab"/>
       <w:jc w:val="center"/>
     </w:pPr>
     <w:r>
@@ -650,7 +727,7 @@
 </file>
 
 <file path=word/footnotes.xml><?xml version="1.0" encoding="utf-8"?>
-<w:footnotes xmlns:wpc="http://schemas.microsoft.com/office/word/2010/wordprocessingCanvas" xmlns:cx="http://schemas.microsoft.com/office/drawing/2014/chartex" xmlns:cx1="http://schemas.microsoft.com/office/drawing/2015/9/8/chartex" xmlns:cx2="http://schemas.microsoft.com/office/drawing/2015/10/21/chartex" xmlns:cx3="http://schemas.microsoft.com/office/drawing/2016/5/9/chartex" xmlns:cx4="http://schemas.microsoft.com/office/drawing/2016/5/10/chartex" xmlns:cx5="http://schemas.microsoft.com/office/drawing/2016/5/11/chartex" xmlns:cx6="http://schemas.microsoft.com/office/drawing/2016/5/12/chartex" xmlns:cx7="http://schemas.microsoft.com/office/drawing/2016/5/13/chartex" xmlns:cx8="http://schemas.microsoft.com/office/drawing/2016/5/14/chartex" xmlns:mc="http://schemas.openxmlformats.org/markup-compatibility/2006" xmlns:aink="http://schemas.microsoft.com/office/drawing/2016/ink" xmlns:am3d="http://schemas.microsoft.com/office/drawing/2017/model3d" xmlns:o="urn:schemas-microsoft-com:office:office" xmlns:oel="http://schemas.microsoft.com/office/2019/extlst" xmlns:r="http://schemas.openxmlformats.org/officeDocument/2006/relationships" xmlns:m="http://schemas.openxmlformats.org/officeDocument/2006/math" xmlns:v="urn:schemas-microsoft-com:vml" xmlns:wp14="http://schemas.microsoft.com/office/word/2010/wordprocessingDrawing" xmlns:wp="http://schemas.openxmlformats.org/drawingml/2006/wordprocessingDrawing" xmlns:w10="urn:schemas-microsoft-com:office:word" xmlns:w="http://schemas.openxmlformats.org/wordprocessingml/2006/main" xmlns:w14="http://schemas.microsoft.com/office/word/2010/wordml" xmlns:w15="http://schemas.microsoft.com/office/word/2012/wordml" xmlns:w16cex="http://schemas.microsoft.com/office/word/2018/wordml/cex" xmlns:w16cid="http://schemas.microsoft.com/office/word/2016/wordml/cid" xmlns:w16="http://schemas.microsoft.com/office/word/2018/wordml" xmlns:w16du="http://schemas.microsoft.com/office/word/2023/wordml/word16du" xmlns:w16sdtdh="http://schemas.microsoft.com/office/word/2020/wordml/sdtdatahash" xmlns:w16sdtfl="http://schemas.microsoft.com/office/word/2024/wordml/sdtformatlock" xmlns:w16se="http://schemas.microsoft.com/office/word/2015/wordml/symex" xmlns:wpg="http://schemas.microsoft.com/office/word/2010/wordprocessingGroup" xmlns:wpi="http://schemas.microsoft.com/office/word/2010/wordprocessingInk" xmlns:wne="http://schemas.microsoft.com/office/word/2006/wordml" xmlns:wps="http://schemas.microsoft.com/office/word/2010/wordprocessingShape" mc:Ignorable="w14 w15 w16se w16cid w16 w16cex w16sdtdh w16sdtfl w16du wp14">
+<w:footnotes xmlns:wpc="http://schemas.microsoft.com/office/word/2010/wordprocessingCanvas" xmlns:cx="http://schemas.microsoft.com/office/drawing/2014/chartex" xmlns:cx1="http://schemas.microsoft.com/office/drawing/2015/9/8/chartex" xmlns:cx2="http://schemas.microsoft.com/office/drawing/2015/10/21/chartex" xmlns:cx3="http://schemas.microsoft.com/office/drawing/2016/5/9/chartex" xmlns:cx4="http://schemas.microsoft.com/office/drawing/2016/5/10/chartex" xmlns:cx5="http://schemas.microsoft.com/office/drawing/2016/5/11/chartex" xmlns:cx6="http://schemas.microsoft.com/office/drawing/2016/5/12/chartex" xmlns:cx7="http://schemas.microsoft.com/office/drawing/2016/5/13/chartex" xmlns:cx8="http://schemas.microsoft.com/office/drawing/2016/5/14/chartex" xmlns:mc="http://schemas.openxmlformats.org/markup-compatibility/2006" xmlns:aink="http://schemas.microsoft.com/office/drawing/2016/ink" xmlns:am3d="http://schemas.microsoft.com/office/drawing/2017/model3d" xmlns:o="urn:schemas-microsoft-com:office:office" xmlns:oel="http://schemas.microsoft.com/office/2019/extlst" xmlns:r="http://schemas.openxmlformats.org/officeDocument/2006/relationships" xmlns:m="http://schemas.openxmlformats.org/officeDocument/2006/math" xmlns:v="urn:schemas-microsoft-com:vml" xmlns:wp14="http://schemas.microsoft.com/office/word/2010/wordprocessingDrawing" xmlns:wp="http://schemas.openxmlformats.org/drawingml/2006/wordprocessingDrawing" xmlns:w10="urn:schemas-microsoft-com:office:word" xmlns:w="http://schemas.openxmlformats.org/wordprocessingml/2006/main" xmlns:w14="http://schemas.microsoft.com/office/word/2010/wordml" xmlns:w15="http://schemas.microsoft.com/office/word/2012/wordml" xmlns:w16cex="http://schemas.microsoft.com/office/word/2018/wordml/cex" xmlns:w16cid="http://schemas.microsoft.com/office/word/2016/wordml/cid" xmlns:w16="http://schemas.microsoft.com/office/word/2018/wordml" xmlns:w16sdtdh="http://schemas.microsoft.com/office/word/2020/wordml/sdtdatahash" xmlns:w16se="http://schemas.microsoft.com/office/word/2015/wordml/symex" xmlns:wpg="http://schemas.microsoft.com/office/word/2010/wordprocessingGroup" xmlns:wpi="http://schemas.microsoft.com/office/word/2010/wordprocessingInk" xmlns:wne="http://schemas.microsoft.com/office/word/2006/wordml" xmlns:wps="http://schemas.microsoft.com/office/word/2010/wordprocessingShape" mc:Ignorable="w14 w15 w16se w16cid w16 w16cex w16sdtdh wp14">
   <w:footnote w:type="separator" w:id="-1">
     <w:p>
       <w:pPr>
@@ -675,7 +752,7 @@
 </file>
 
 <file path=word/numbering.xml><?xml version="1.0" encoding="utf-8"?>
-<w:numbering xmlns:wpc="http://schemas.microsoft.com/office/word/2010/wordprocessingCanvas" xmlns:cx="http://schemas.microsoft.com/office/drawing/2014/chartex" xmlns:cx1="http://schemas.microsoft.com/office/drawing/2015/9/8/chartex" xmlns:cx2="http://schemas.microsoft.com/office/drawing/2015/10/21/chartex" xmlns:cx3="http://schemas.microsoft.com/office/drawing/2016/5/9/chartex" xmlns:cx4="http://schemas.microsoft.com/office/drawing/2016/5/10/chartex" xmlns:cx5="http://schemas.microsoft.com/office/drawing/2016/5/11/chartex" xmlns:cx6="http://schemas.microsoft.com/office/drawing/2016/5/12/chartex" xmlns:cx7="http://schemas.microsoft.com/office/drawing/2016/5/13/chartex" xmlns:cx8="http://schemas.microsoft.com/office/drawing/2016/5/14/chartex" xmlns:mc="http://schemas.openxmlformats.org/markup-compatibility/2006" xmlns:aink="http://schemas.microsoft.com/office/drawing/2016/ink" xmlns:am3d="http://schemas.microsoft.com/office/drawing/2017/model3d" xmlns:o="urn:schemas-microsoft-com:office:office" xmlns:oel="http://schemas.microsoft.com/office/2019/extlst" xmlns:r="http://schemas.openxmlformats.org/officeDocument/2006/relationships" xmlns:m="http://schemas.openxmlformats.org/officeDocument/2006/math" xmlns:v="urn:schemas-microsoft-com:vml" xmlns:wp14="http://schemas.microsoft.com/office/word/2010/wordprocessingDrawing" xmlns:wp="http://schemas.openxmlformats.org/drawingml/2006/wordprocessingDrawing" xmlns:w10="urn:schemas-microsoft-com:office:word" xmlns:w="http://schemas.openxmlformats.org/wordprocessingml/2006/main" xmlns:w14="http://schemas.microsoft.com/office/word/2010/wordml" xmlns:w15="http://schemas.microsoft.com/office/word/2012/wordml" xmlns:w16cex="http://schemas.microsoft.com/office/word/2018/wordml/cex" xmlns:w16cid="http://schemas.microsoft.com/office/word/2016/wordml/cid" xmlns:w16="http://schemas.microsoft.com/office/word/2018/wordml" xmlns:w16du="http://schemas.microsoft.com/office/word/2023/wordml/word16du" xmlns:w16sdtdh="http://schemas.microsoft.com/office/word/2020/wordml/sdtdatahash" xmlns:w16sdtfl="http://schemas.microsoft.com/office/word/2024/wordml/sdtformatlock" xmlns:w16se="http://schemas.microsoft.com/office/word/2015/wordml/symex" xmlns:wpg="http://schemas.microsoft.com/office/word/2010/wordprocessingGroup" xmlns:wpi="http://schemas.microsoft.com/office/word/2010/wordprocessingInk" xmlns:wne="http://schemas.microsoft.com/office/word/2006/wordml" xmlns:wps="http://schemas.microsoft.com/office/word/2010/wordprocessingShape" mc:Ignorable="w14 w15 w16se w16cid w16 w16cex w16sdtdh w16sdtfl w16du wp14">
+<w:numbering xmlns:wpc="http://schemas.microsoft.com/office/word/2010/wordprocessingCanvas" xmlns:cx="http://schemas.microsoft.com/office/drawing/2014/chartex" xmlns:cx1="http://schemas.microsoft.com/office/drawing/2015/9/8/chartex" xmlns:cx2="http://schemas.microsoft.com/office/drawing/2015/10/21/chartex" xmlns:cx3="http://schemas.microsoft.com/office/drawing/2016/5/9/chartex" xmlns:cx4="http://schemas.microsoft.com/office/drawing/2016/5/10/chartex" xmlns:cx5="http://schemas.microsoft.com/office/drawing/2016/5/11/chartex" xmlns:cx6="http://schemas.microsoft.com/office/drawing/2016/5/12/chartex" xmlns:cx7="http://schemas.microsoft.com/office/drawing/2016/5/13/chartex" xmlns:cx8="http://schemas.microsoft.com/office/drawing/2016/5/14/chartex" xmlns:mc="http://schemas.openxmlformats.org/markup-compatibility/2006" xmlns:aink="http://schemas.microsoft.com/office/drawing/2016/ink" xmlns:am3d="http://schemas.microsoft.com/office/drawing/2017/model3d" xmlns:o="urn:schemas-microsoft-com:office:office" xmlns:oel="http://schemas.microsoft.com/office/2019/extlst" xmlns:r="http://schemas.openxmlformats.org/officeDocument/2006/relationships" xmlns:m="http://schemas.openxmlformats.org/officeDocument/2006/math" xmlns:v="urn:schemas-microsoft-com:vml" xmlns:wp14="http://schemas.microsoft.com/office/word/2010/wordprocessingDrawing" xmlns:wp="http://schemas.openxmlformats.org/drawingml/2006/wordprocessingDrawing" xmlns:w10="urn:schemas-microsoft-com:office:word" xmlns:w="http://schemas.openxmlformats.org/wordprocessingml/2006/main" xmlns:w14="http://schemas.microsoft.com/office/word/2010/wordml" xmlns:w15="http://schemas.microsoft.com/office/word/2012/wordml" xmlns:w16cex="http://schemas.microsoft.com/office/word/2018/wordml/cex" xmlns:w16cid="http://schemas.microsoft.com/office/word/2016/wordml/cid" xmlns:w16="http://schemas.microsoft.com/office/word/2018/wordml" xmlns:w16sdtdh="http://schemas.microsoft.com/office/word/2020/wordml/sdtdatahash" xmlns:w16se="http://schemas.microsoft.com/office/word/2015/wordml/symex" xmlns:wpg="http://schemas.microsoft.com/office/word/2010/wordprocessingGroup" xmlns:wpi="http://schemas.microsoft.com/office/word/2010/wordprocessingInk" xmlns:wne="http://schemas.microsoft.com/office/word/2006/wordml" xmlns:wps="http://schemas.microsoft.com/office/word/2010/wordprocessingShape" mc:Ignorable="w14 w15 w16se w16cid w16 w16cex w16sdtdh wp14">
   <w:abstractNum w:abstractNumId="0" w15:restartNumberingAfterBreak="0">
     <w:nsid w:val="FFFFFF7E"/>
     <w:multiLevelType w:val="singleLevel"/>
@@ -683,7 +760,7 @@
     <w:lvl w:ilvl="0">
       <w:start w:val="1"/>
       <w:numFmt w:val="decimal"/>
-      <w:pStyle w:val="ListNumber3"/>
+      <w:pStyle w:val="3"/>
       <w:lvlText w:val="%1."/>
       <w:lvlJc w:val="left"/>
       <w:pPr>
@@ -701,7 +778,7 @@
     <w:lvl w:ilvl="0">
       <w:start w:val="1"/>
       <w:numFmt w:val="decimal"/>
-      <w:pStyle w:val="ListNumber2"/>
+      <w:pStyle w:val="2"/>
       <w:lvlText w:val="%1."/>
       <w:lvlJc w:val="left"/>
       <w:pPr>
@@ -719,7 +796,7 @@
     <w:lvl w:ilvl="0">
       <w:start w:val="1"/>
       <w:numFmt w:val="bullet"/>
-      <w:pStyle w:val="ListBullet3"/>
+      <w:pStyle w:val="30"/>
       <w:lvlText w:val=""/>
       <w:lvlJc w:val="left"/>
       <w:pPr>
@@ -740,7 +817,7 @@
     <w:lvl w:ilvl="0">
       <w:start w:val="1"/>
       <w:numFmt w:val="bullet"/>
-      <w:pStyle w:val="ListBullet2"/>
+      <w:pStyle w:val="20"/>
       <w:lvlText w:val=""/>
       <w:lvlJc w:val="left"/>
       <w:pPr>
@@ -761,7 +838,7 @@
     <w:lvl w:ilvl="0">
       <w:start w:val="1"/>
       <w:numFmt w:val="decimal"/>
-      <w:pStyle w:val="ListNumber"/>
+      <w:pStyle w:val="a"/>
       <w:lvlText w:val="%1."/>
       <w:lvlJc w:val="left"/>
       <w:pPr>
@@ -779,7 +856,7 @@
     <w:lvl w:ilvl="0">
       <w:start w:val="1"/>
       <w:numFmt w:val="bullet"/>
-      <w:pStyle w:val="ListBullet"/>
+      <w:pStyle w:val="a0"/>
       <w:lvlText w:val=""/>
       <w:lvlJc w:val="left"/>
       <w:pPr>
@@ -815,7 +892,7 @@
 </file>
 
 <file path=word/styles.xml><?xml version="1.0" encoding="utf-8"?>
-<w:styles xmlns:mc="http://schemas.openxmlformats.org/markup-compatibility/2006" xmlns:r="http://schemas.openxmlformats.org/officeDocument/2006/relationships" xmlns:w="http://schemas.openxmlformats.org/wordprocessingml/2006/main" xmlns:w14="http://schemas.microsoft.com/office/word/2010/wordml" xmlns:w15="http://schemas.microsoft.com/office/word/2012/wordml" xmlns:w16cex="http://schemas.microsoft.com/office/word/2018/wordml/cex" xmlns:w16cid="http://schemas.microsoft.com/office/word/2016/wordml/cid" xmlns:w16="http://schemas.microsoft.com/office/word/2018/wordml" xmlns:w16du="http://schemas.microsoft.com/office/word/2023/wordml/word16du" xmlns:w16sdtdh="http://schemas.microsoft.com/office/word/2020/wordml/sdtdatahash" xmlns:w16sdtfl="http://schemas.microsoft.com/office/word/2024/wordml/sdtformatlock" xmlns:w16se="http://schemas.microsoft.com/office/word/2015/wordml/symex" mc:Ignorable="w14 w15 w16se w16cid w16 w16cex w16sdtdh w16sdtfl w16du">
+<w:styles xmlns:mc="http://schemas.openxmlformats.org/markup-compatibility/2006" xmlns:r="http://schemas.openxmlformats.org/officeDocument/2006/relationships" xmlns:w="http://schemas.openxmlformats.org/wordprocessingml/2006/main" xmlns:w14="http://schemas.microsoft.com/office/word/2010/wordml" xmlns:w15="http://schemas.microsoft.com/office/word/2012/wordml" xmlns:w16cex="http://schemas.microsoft.com/office/word/2018/wordml/cex" xmlns:w16cid="http://schemas.microsoft.com/office/word/2016/wordml/cid" xmlns:w16="http://schemas.microsoft.com/office/word/2018/wordml" xmlns:w16sdtdh="http://schemas.microsoft.com/office/word/2020/wordml/sdtdatahash" xmlns:w16se="http://schemas.microsoft.com/office/word/2015/wordml/symex" mc:Ignorable="w14 w15 w16se w16cid w16 w16cex w16sdtdh">
   <w:docDefaults>
     <w:rPrDefault>
       <w:rPr>
@@ -1203,7 +1280,7 @@
     <w:lsdException w:name="Unresolved Mention" w:semiHidden="1" w:unhideWhenUsed="1"/>
     <w:lsdException w:name="Smart Link" w:semiHidden="1" w:unhideWhenUsed="1"/>
   </w:latentStyles>
-  <w:style w:type="paragraph" w:default="1" w:styleId="Normal">
+  <w:style w:type="paragraph" w:default="1" w:styleId="a1">
     <w:name w:val="Normal"/>
     <w:qFormat/>
     <w:pPr>
@@ -1216,11 +1293,11 @@
       <w:lang w:val="en-US" w:eastAsia="en-US"/>
     </w:rPr>
   </w:style>
-  <w:style w:type="paragraph" w:styleId="Heading1">
+  <w:style w:type="paragraph" w:styleId="1">
     <w:name w:val="heading 1"/>
-    <w:basedOn w:val="Normal"/>
-    <w:next w:val="Normal"/>
-    <w:link w:val="Heading1Char"/>
+    <w:basedOn w:val="a1"/>
+    <w:next w:val="a1"/>
+    <w:link w:val="10"/>
     <w:uiPriority w:val="9"/>
     <w:qFormat/>
     <w:pPr>
@@ -1238,11 +1315,11 @@
       <w:szCs w:val="28"/>
     </w:rPr>
   </w:style>
-  <w:style w:type="paragraph" w:styleId="Heading2">
+  <w:style w:type="paragraph" w:styleId="21">
     <w:name w:val="heading 2"/>
-    <w:basedOn w:val="Normal"/>
-    <w:next w:val="Normal"/>
-    <w:link w:val="Heading2Char"/>
+    <w:basedOn w:val="a1"/>
+    <w:next w:val="a1"/>
+    <w:link w:val="22"/>
     <w:uiPriority w:val="9"/>
     <w:unhideWhenUsed/>
     <w:qFormat/>
@@ -1261,11 +1338,11 @@
       <w:szCs w:val="26"/>
     </w:rPr>
   </w:style>
-  <w:style w:type="paragraph" w:styleId="Heading3">
+  <w:style w:type="paragraph" w:styleId="31">
     <w:name w:val="heading 3"/>
-    <w:basedOn w:val="Normal"/>
-    <w:next w:val="Normal"/>
-    <w:link w:val="Heading3Char"/>
+    <w:basedOn w:val="a1"/>
+    <w:next w:val="a1"/>
+    <w:link w:val="32"/>
     <w:uiPriority w:val="9"/>
     <w:unhideWhenUsed/>
     <w:qFormat/>
@@ -1282,11 +1359,11 @@
       <w:color w:val="4F81BD" w:themeColor="accent1"/>
     </w:rPr>
   </w:style>
-  <w:style w:type="paragraph" w:styleId="Heading4">
+  <w:style w:type="paragraph" w:styleId="4">
     <w:name w:val="heading 4"/>
-    <w:basedOn w:val="Normal"/>
-    <w:next w:val="Normal"/>
-    <w:link w:val="Heading4Char"/>
+    <w:basedOn w:val="a1"/>
+    <w:next w:val="a1"/>
+    <w:link w:val="40"/>
     <w:uiPriority w:val="9"/>
     <w:semiHidden/>
     <w:unhideWhenUsed/>
@@ -1306,11 +1383,11 @@
       <w:color w:val="4F81BD" w:themeColor="accent1"/>
     </w:rPr>
   </w:style>
-  <w:style w:type="paragraph" w:styleId="Heading5">
+  <w:style w:type="paragraph" w:styleId="5">
     <w:name w:val="heading 5"/>
-    <w:basedOn w:val="Normal"/>
-    <w:next w:val="Normal"/>
-    <w:link w:val="Heading5Char"/>
+    <w:basedOn w:val="a1"/>
+    <w:next w:val="a1"/>
+    <w:link w:val="50"/>
     <w:uiPriority w:val="9"/>
     <w:semiHidden/>
     <w:unhideWhenUsed/>
@@ -1326,11 +1403,11 @@
       <w:color w:val="244061" w:themeColor="accent1" w:themeShade="80"/>
     </w:rPr>
   </w:style>
-  <w:style w:type="paragraph" w:styleId="Heading6">
+  <w:style w:type="paragraph" w:styleId="6">
     <w:name w:val="heading 6"/>
-    <w:basedOn w:val="Normal"/>
-    <w:next w:val="Normal"/>
-    <w:link w:val="Heading6Char"/>
+    <w:basedOn w:val="a1"/>
+    <w:next w:val="a1"/>
+    <w:link w:val="60"/>
     <w:uiPriority w:val="9"/>
     <w:semiHidden/>
     <w:unhideWhenUsed/>
@@ -1348,11 +1425,11 @@
       <w:color w:val="244061" w:themeColor="accent1" w:themeShade="80"/>
     </w:rPr>
   </w:style>
-  <w:style w:type="paragraph" w:styleId="Heading7">
+  <w:style w:type="paragraph" w:styleId="7">
     <w:name w:val="heading 7"/>
-    <w:basedOn w:val="Normal"/>
-    <w:next w:val="Normal"/>
-    <w:link w:val="Heading7Char"/>
+    <w:basedOn w:val="a1"/>
+    <w:next w:val="a1"/>
+    <w:link w:val="70"/>
     <w:uiPriority w:val="9"/>
     <w:semiHidden/>
     <w:unhideWhenUsed/>
@@ -1370,11 +1447,11 @@
       <w:color w:val="404040" w:themeColor="text1" w:themeTint="BF"/>
     </w:rPr>
   </w:style>
-  <w:style w:type="paragraph" w:styleId="Heading8">
+  <w:style w:type="paragraph" w:styleId="8">
     <w:name w:val="heading 8"/>
-    <w:basedOn w:val="Normal"/>
-    <w:next w:val="Normal"/>
-    <w:link w:val="Heading8Char"/>
+    <w:basedOn w:val="a1"/>
+    <w:next w:val="a1"/>
+    <w:link w:val="80"/>
     <w:uiPriority w:val="9"/>
     <w:semiHidden/>
     <w:unhideWhenUsed/>
@@ -1392,11 +1469,11 @@
       <w:szCs w:val="20"/>
     </w:rPr>
   </w:style>
-  <w:style w:type="paragraph" w:styleId="Heading9">
+  <w:style w:type="paragraph" w:styleId="9">
     <w:name w:val="heading 9"/>
-    <w:basedOn w:val="Normal"/>
-    <w:next w:val="Normal"/>
-    <w:link w:val="Heading9Char"/>
+    <w:basedOn w:val="a1"/>
+    <w:next w:val="a1"/>
+    <w:link w:val="90"/>
     <w:uiPriority w:val="9"/>
     <w:semiHidden/>
     <w:unhideWhenUsed/>
@@ -1416,13 +1493,13 @@
       <w:szCs w:val="20"/>
     </w:rPr>
   </w:style>
-  <w:style w:type="character" w:default="1" w:styleId="DefaultParagraphFont">
+  <w:style w:type="character" w:default="1" w:styleId="a2">
     <w:name w:val="Default Paragraph Font"/>
     <w:uiPriority w:val="1"/>
     <w:semiHidden/>
     <w:unhideWhenUsed/>
   </w:style>
-  <w:style w:type="table" w:default="1" w:styleId="TableNormal">
+  <w:style w:type="table" w:default="1" w:styleId="a3">
     <w:name w:val="Normal Table"/>
     <w:uiPriority w:val="99"/>
     <w:semiHidden/>
@@ -1437,15 +1514,15 @@
       </w:tblCellMar>
     </w:tblPr>
   </w:style>
-  <w:style w:type="numbering" w:default="1" w:styleId="NoList">
+  <w:style w:type="numbering" w:default="1" w:styleId="a4">
     <w:name w:val="No List"/>
     <w:uiPriority w:val="99"/>
     <w:semiHidden/>
     <w:unhideWhenUsed/>
   </w:style>
-  <w:style w:type="paragraph" w:styleId="MacroText">
+  <w:style w:type="paragraph" w:styleId="a5">
     <w:name w:val="macro"/>
-    <w:link w:val="MacroTextChar"/>
+    <w:link w:val="a6"/>
     <w:uiPriority w:val="99"/>
     <w:unhideWhenUsed/>
     <w:pPr>
@@ -1465,9 +1542,9 @@
       <w:lang w:val="en-US" w:eastAsia="en-US"/>
     </w:rPr>
   </w:style>
-  <w:style w:type="paragraph" w:styleId="List3">
+  <w:style w:type="paragraph" w:styleId="33">
     <w:name w:val="List 3"/>
-    <w:basedOn w:val="Normal"/>
+    <w:basedOn w:val="a1"/>
     <w:uiPriority w:val="99"/>
     <w:unhideWhenUsed/>
     <w:pPr>
@@ -1475,9 +1552,9 @@
       <w:contextualSpacing/>
     </w:pPr>
   </w:style>
-  <w:style w:type="paragraph" w:styleId="ListNumber2">
+  <w:style w:type="paragraph" w:styleId="2">
     <w:name w:val="List Number 2"/>
-    <w:basedOn w:val="Normal"/>
+    <w:basedOn w:val="a1"/>
     <w:uiPriority w:val="99"/>
     <w:unhideWhenUsed/>
     <w:pPr>
@@ -1487,9 +1564,9 @@
       <w:contextualSpacing/>
     </w:pPr>
   </w:style>
-  <w:style w:type="paragraph" w:styleId="ListNumber">
+  <w:style w:type="paragraph" w:styleId="a">
     <w:name w:val="List Number"/>
-    <w:basedOn w:val="Normal"/>
+    <w:basedOn w:val="a1"/>
     <w:uiPriority w:val="99"/>
     <w:unhideWhenUsed/>
     <w:pPr>
@@ -1499,10 +1576,10 @@
       <w:contextualSpacing/>
     </w:pPr>
   </w:style>
-  <w:style w:type="paragraph" w:styleId="Caption">
+  <w:style w:type="paragraph" w:styleId="a7">
     <w:name w:val="caption"/>
-    <w:basedOn w:val="Normal"/>
-    <w:next w:val="Normal"/>
+    <w:basedOn w:val="a1"/>
+    <w:next w:val="a1"/>
     <w:uiPriority w:val="35"/>
     <w:semiHidden/>
     <w:unhideWhenUsed/>
@@ -1518,9 +1595,9 @@
       <w:szCs w:val="18"/>
     </w:rPr>
   </w:style>
-  <w:style w:type="paragraph" w:styleId="ListBullet">
+  <w:style w:type="paragraph" w:styleId="a0">
     <w:name w:val="List Bullet"/>
-    <w:basedOn w:val="Normal"/>
+    <w:basedOn w:val="a1"/>
     <w:uiPriority w:val="99"/>
     <w:unhideWhenUsed/>
     <w:pPr>
@@ -1530,10 +1607,10 @@
       <w:contextualSpacing/>
     </w:pPr>
   </w:style>
-  <w:style w:type="paragraph" w:styleId="BodyText3">
+  <w:style w:type="paragraph" w:styleId="34">
     <w:name w:val="Body Text 3"/>
-    <w:basedOn w:val="Normal"/>
-    <w:link w:val="BodyText3Char"/>
+    <w:basedOn w:val="a1"/>
+    <w:link w:val="35"/>
     <w:uiPriority w:val="99"/>
     <w:unhideWhenUsed/>
     <w:pPr>
@@ -1544,9 +1621,9 @@
       <w:szCs w:val="16"/>
     </w:rPr>
   </w:style>
-  <w:style w:type="paragraph" w:styleId="ListBullet3">
+  <w:style w:type="paragraph" w:styleId="30">
     <w:name w:val="List Bullet 3"/>
-    <w:basedOn w:val="Normal"/>
+    <w:basedOn w:val="a1"/>
     <w:uiPriority w:val="99"/>
     <w:unhideWhenUsed/>
     <w:pPr>
@@ -1556,19 +1633,19 @@
       <w:contextualSpacing/>
     </w:pPr>
   </w:style>
-  <w:style w:type="paragraph" w:styleId="BodyText">
+  <w:style w:type="paragraph" w:styleId="a8">
     <w:name w:val="Body Text"/>
-    <w:basedOn w:val="Normal"/>
-    <w:link w:val="BodyTextChar"/>
+    <w:basedOn w:val="a1"/>
+    <w:link w:val="a9"/>
     <w:uiPriority w:val="99"/>
     <w:unhideWhenUsed/>
     <w:pPr>
       <w:spacing w:after="120"/>
     </w:pPr>
   </w:style>
-  <w:style w:type="paragraph" w:styleId="ListNumber3">
+  <w:style w:type="paragraph" w:styleId="3">
     <w:name w:val="List Number 3"/>
-    <w:basedOn w:val="Normal"/>
+    <w:basedOn w:val="a1"/>
     <w:uiPriority w:val="99"/>
     <w:unhideWhenUsed/>
     <w:pPr>
@@ -1578,9 +1655,9 @@
       <w:contextualSpacing/>
     </w:pPr>
   </w:style>
-  <w:style w:type="paragraph" w:styleId="List2">
+  <w:style w:type="paragraph" w:styleId="23">
     <w:name w:val="List 2"/>
-    <w:basedOn w:val="Normal"/>
+    <w:basedOn w:val="a1"/>
     <w:uiPriority w:val="99"/>
     <w:unhideWhenUsed/>
     <w:pPr>
@@ -1588,9 +1665,9 @@
       <w:contextualSpacing/>
     </w:pPr>
   </w:style>
-  <w:style w:type="paragraph" w:styleId="ListContinue">
+  <w:style w:type="paragraph" w:styleId="aa">
     <w:name w:val="List Continue"/>
-    <w:basedOn w:val="Normal"/>
+    <w:basedOn w:val="a1"/>
     <w:uiPriority w:val="99"/>
     <w:unhideWhenUsed/>
     <w:pPr>
@@ -1599,9 +1676,9 @@
       <w:contextualSpacing/>
     </w:pPr>
   </w:style>
-  <w:style w:type="paragraph" w:styleId="ListBullet2">
+  <w:style w:type="paragraph" w:styleId="20">
     <w:name w:val="List Bullet 2"/>
-    <w:basedOn w:val="Normal"/>
+    <w:basedOn w:val="a1"/>
     <w:uiPriority w:val="99"/>
     <w:unhideWhenUsed/>
     <w:pPr>
@@ -1611,10 +1688,10 @@
       <w:contextualSpacing/>
     </w:pPr>
   </w:style>
-  <w:style w:type="paragraph" w:styleId="Footer">
+  <w:style w:type="paragraph" w:styleId="ab">
     <w:name w:val="footer"/>
-    <w:basedOn w:val="Normal"/>
-    <w:link w:val="FooterChar"/>
+    <w:basedOn w:val="a1"/>
+    <w:link w:val="ac"/>
     <w:uiPriority w:val="99"/>
     <w:unhideWhenUsed/>
     <w:pPr>
@@ -1625,10 +1702,10 @@
       <w:spacing w:after="0" w:line="240" w:lineRule="auto"/>
     </w:pPr>
   </w:style>
-  <w:style w:type="paragraph" w:styleId="Header">
+  <w:style w:type="paragraph" w:styleId="ad">
     <w:name w:val="header"/>
-    <w:basedOn w:val="Normal"/>
-    <w:link w:val="HeaderChar"/>
+    <w:basedOn w:val="a1"/>
+    <w:link w:val="ae"/>
     <w:uiPriority w:val="99"/>
     <w:unhideWhenUsed/>
     <w:pPr>
@@ -1639,11 +1716,11 @@
       <w:spacing w:after="0" w:line="240" w:lineRule="auto"/>
     </w:pPr>
   </w:style>
-  <w:style w:type="paragraph" w:styleId="Subtitle">
+  <w:style w:type="paragraph" w:styleId="af">
     <w:name w:val="Subtitle"/>
-    <w:basedOn w:val="Normal"/>
-    <w:next w:val="Normal"/>
-    <w:link w:val="SubtitleChar"/>
+    <w:basedOn w:val="a1"/>
+    <w:next w:val="a1"/>
+    <w:link w:val="af0"/>
     <w:uiPriority w:val="11"/>
     <w:qFormat/>
     <w:rPr>
@@ -1656,9 +1733,9 @@
       <w:szCs w:val="24"/>
     </w:rPr>
   </w:style>
-  <w:style w:type="paragraph" w:styleId="List">
+  <w:style w:type="paragraph" w:styleId="af1">
     <w:name w:val="List"/>
-    <w:basedOn w:val="Normal"/>
+    <w:basedOn w:val="a1"/>
     <w:uiPriority w:val="99"/>
     <w:unhideWhenUsed/>
     <w:pPr>
@@ -1666,19 +1743,19 @@
       <w:contextualSpacing/>
     </w:pPr>
   </w:style>
-  <w:style w:type="paragraph" w:styleId="BodyText2">
+  <w:style w:type="paragraph" w:styleId="24">
     <w:name w:val="Body Text 2"/>
-    <w:basedOn w:val="Normal"/>
-    <w:link w:val="BodyText2Char"/>
+    <w:basedOn w:val="a1"/>
+    <w:link w:val="25"/>
     <w:uiPriority w:val="99"/>
     <w:unhideWhenUsed/>
     <w:pPr>
       <w:spacing w:after="120" w:line="480" w:lineRule="auto"/>
     </w:pPr>
   </w:style>
-  <w:style w:type="paragraph" w:styleId="ListContinue2">
+  <w:style w:type="paragraph" w:styleId="26">
     <w:name w:val="List Continue 2"/>
-    <w:basedOn w:val="Normal"/>
+    <w:basedOn w:val="a1"/>
     <w:uiPriority w:val="99"/>
     <w:unhideWhenUsed/>
     <w:pPr>
@@ -1687,9 +1764,9 @@
       <w:contextualSpacing/>
     </w:pPr>
   </w:style>
-  <w:style w:type="paragraph" w:styleId="ListContinue3">
+  <w:style w:type="paragraph" w:styleId="36">
     <w:name w:val="List Continue 3"/>
-    <w:basedOn w:val="Normal"/>
+    <w:basedOn w:val="a1"/>
     <w:uiPriority w:val="99"/>
     <w:unhideWhenUsed/>
     <w:pPr>
@@ -1698,11 +1775,11 @@
       <w:contextualSpacing/>
     </w:pPr>
   </w:style>
-  <w:style w:type="paragraph" w:styleId="Title">
+  <w:style w:type="paragraph" w:styleId="af2">
     <w:name w:val="Title"/>
-    <w:basedOn w:val="Normal"/>
-    <w:next w:val="Normal"/>
-    <w:link w:val="TitleChar"/>
+    <w:basedOn w:val="a1"/>
+    <w:next w:val="a1"/>
+    <w:link w:val="af3"/>
     <w:uiPriority w:val="10"/>
     <w:qFormat/>
     <w:pPr>
@@ -1721,9 +1798,9 @@
       <w:szCs w:val="52"/>
     </w:rPr>
   </w:style>
-  <w:style w:type="table" w:styleId="TableGrid">
+  <w:style w:type="table" w:styleId="af4">
     <w:name w:val="Table Grid"/>
-    <w:basedOn w:val="TableNormal"/>
+    <w:basedOn w:val="a3"/>
     <w:uiPriority w:val="59"/>
     <w:tblPr>
       <w:tblBorders>
@@ -1736,9 +1813,9 @@
       </w:tblBorders>
     </w:tblPr>
   </w:style>
-  <w:style w:type="table" w:styleId="LightShading">
+  <w:style w:type="table" w:styleId="af5">
     <w:name w:val="Light Shading"/>
-    <w:basedOn w:val="TableNormal"/>
+    <w:basedOn w:val="a3"/>
     <w:uiPriority w:val="60"/>
     <w:rPr>
       <w:color w:val="000000" w:themeColor="text1" w:themeShade="BF"/>
@@ -1826,9 +1903,9 @@
       </w:tcPr>
     </w:tblStylePr>
   </w:style>
-  <w:style w:type="table" w:styleId="LightShading-Accent1">
+  <w:style w:type="table" w:styleId="-1">
     <w:name w:val="Light Shading Accent 1"/>
-    <w:basedOn w:val="TableNormal"/>
+    <w:basedOn w:val="a3"/>
     <w:uiPriority w:val="60"/>
     <w:rPr>
       <w:color w:val="365F91" w:themeColor="accent1" w:themeShade="BF"/>
@@ -1916,9 +1993,9 @@
       </w:tcPr>
     </w:tblStylePr>
   </w:style>
-  <w:style w:type="table" w:styleId="LightShading-Accent2">
+  <w:style w:type="table" w:styleId="-2">
     <w:name w:val="Light Shading Accent 2"/>
-    <w:basedOn w:val="TableNormal"/>
+    <w:basedOn w:val="a3"/>
     <w:uiPriority w:val="60"/>
     <w:rPr>
       <w:color w:val="943634" w:themeColor="accent2" w:themeShade="BF"/>
@@ -2006,9 +2083,9 @@
       </w:tcPr>
     </w:tblStylePr>
   </w:style>
-  <w:style w:type="table" w:styleId="LightShading-Accent3">
+  <w:style w:type="table" w:styleId="-3">
     <w:name w:val="Light Shading Accent 3"/>
-    <w:basedOn w:val="TableNormal"/>
+    <w:basedOn w:val="a3"/>
     <w:uiPriority w:val="60"/>
     <w:rPr>
       <w:color w:val="76923C" w:themeColor="accent3" w:themeShade="BF"/>
@@ -2096,9 +2173,9 @@
       </w:tcPr>
     </w:tblStylePr>
   </w:style>
-  <w:style w:type="table" w:styleId="LightShading-Accent4">
+  <w:style w:type="table" w:styleId="-4">
     <w:name w:val="Light Shading Accent 4"/>
-    <w:basedOn w:val="TableNormal"/>
+    <w:basedOn w:val="a3"/>
     <w:uiPriority w:val="60"/>
     <w:rPr>
       <w:color w:val="5F497A" w:themeColor="accent4" w:themeShade="BF"/>
@@ -2186,9 +2263,9 @@
       </w:tcPr>
     </w:tblStylePr>
   </w:style>
-  <w:style w:type="table" w:styleId="LightShading-Accent5">
+  <w:style w:type="table" w:styleId="-5">
     <w:name w:val="Light Shading Accent 5"/>
-    <w:basedOn w:val="TableNormal"/>
+    <w:basedOn w:val="a3"/>
     <w:uiPriority w:val="60"/>
     <w:rPr>
       <w:color w:val="31849B" w:themeColor="accent5" w:themeShade="BF"/>
@@ -2276,9 +2353,9 @@
       </w:tcPr>
     </w:tblStylePr>
   </w:style>
-  <w:style w:type="table" w:styleId="LightShading-Accent6">
+  <w:style w:type="table" w:styleId="-6">
     <w:name w:val="Light Shading Accent 6"/>
-    <w:basedOn w:val="TableNormal"/>
+    <w:basedOn w:val="a3"/>
     <w:uiPriority w:val="60"/>
     <w:rPr>
       <w:color w:val="E36C0A" w:themeColor="accent6" w:themeShade="BF"/>
@@ -2366,9 +2443,9 @@
       </w:tcPr>
     </w:tblStylePr>
   </w:style>
-  <w:style w:type="table" w:styleId="LightList">
+  <w:style w:type="table" w:styleId="af6">
     <w:name w:val="Light List"/>
-    <w:basedOn w:val="TableNormal"/>
+    <w:basedOn w:val="a3"/>
     <w:uiPriority w:val="61"/>
     <w:tblPr>
       <w:tblBorders>
@@ -2445,9 +2522,9 @@
       </w:tcPr>
     </w:tblStylePr>
   </w:style>
-  <w:style w:type="table" w:styleId="LightList-Accent1">
+  <w:style w:type="table" w:styleId="-10">
     <w:name w:val="Light List Accent 1"/>
-    <w:basedOn w:val="TableNormal"/>
+    <w:basedOn w:val="a3"/>
     <w:uiPriority w:val="61"/>
     <w:tblPr>
       <w:tblBorders>
@@ -2524,9 +2601,9 @@
       </w:tcPr>
     </w:tblStylePr>
   </w:style>
-  <w:style w:type="table" w:styleId="LightList-Accent2">
+  <w:style w:type="table" w:styleId="-20">
     <w:name w:val="Light List Accent 2"/>
-    <w:basedOn w:val="TableNormal"/>
+    <w:basedOn w:val="a3"/>
     <w:uiPriority w:val="61"/>
     <w:tblPr>
       <w:tblBorders>
@@ -2603,9 +2680,9 @@
       </w:tcPr>
     </w:tblStylePr>
   </w:style>
-  <w:style w:type="table" w:styleId="LightList-Accent3">
+  <w:style w:type="table" w:styleId="-30">
     <w:name w:val="Light List Accent 3"/>
-    <w:basedOn w:val="TableNormal"/>
+    <w:basedOn w:val="a3"/>
     <w:uiPriority w:val="61"/>
     <w:tblPr>
       <w:tblBorders>
@@ -2682,9 +2759,9 @@
       </w:tcPr>
     </w:tblStylePr>
   </w:style>
-  <w:style w:type="table" w:styleId="LightList-Accent4">
+  <w:style w:type="table" w:styleId="-40">
     <w:name w:val="Light List Accent 4"/>
-    <w:basedOn w:val="TableNormal"/>
+    <w:basedOn w:val="a3"/>
     <w:uiPriority w:val="61"/>
     <w:tblPr>
       <w:tblBorders>
@@ -2761,9 +2838,9 @@
       </w:tcPr>
     </w:tblStylePr>
   </w:style>
-  <w:style w:type="table" w:styleId="LightList-Accent5">
+  <w:style w:type="table" w:styleId="-50">
     <w:name w:val="Light List Accent 5"/>
-    <w:basedOn w:val="TableNormal"/>
+    <w:basedOn w:val="a3"/>
     <w:uiPriority w:val="61"/>
     <w:tblPr>
       <w:tblBorders>
@@ -2840,9 +2917,9 @@
       </w:tcPr>
     </w:tblStylePr>
   </w:style>
-  <w:style w:type="table" w:styleId="LightList-Accent6">
+  <w:style w:type="table" w:styleId="-60">
     <w:name w:val="Light List Accent 6"/>
-    <w:basedOn w:val="TableNormal"/>
+    <w:basedOn w:val="a3"/>
     <w:uiPriority w:val="61"/>
     <w:tblPr>
       <w:tblBorders>
@@ -2919,9 +2996,9 @@
       </w:tcPr>
     </w:tblStylePr>
   </w:style>
-  <w:style w:type="table" w:styleId="LightGrid">
+  <w:style w:type="table" w:styleId="af7">
     <w:name w:val="Light Grid"/>
-    <w:basedOn w:val="TableNormal"/>
+    <w:basedOn w:val="a3"/>
     <w:uiPriority w:val="62"/>
     <w:tblPr>
       <w:tblBorders>
@@ -3036,9 +3113,9 @@
       </w:tcPr>
     </w:tblStylePr>
   </w:style>
-  <w:style w:type="table" w:styleId="LightGrid-Accent1">
+  <w:style w:type="table" w:styleId="-11">
     <w:name w:val="Light Grid Accent 1"/>
-    <w:basedOn w:val="TableNormal"/>
+    <w:basedOn w:val="a3"/>
     <w:uiPriority w:val="62"/>
     <w:tblPr>
       <w:tblBorders>
@@ -3153,9 +3230,9 @@
       </w:tcPr>
     </w:tblStylePr>
   </w:style>
-  <w:style w:type="table" w:styleId="LightGrid-Accent2">
+  <w:style w:type="table" w:styleId="-21">
     <w:name w:val="Light Grid Accent 2"/>
-    <w:basedOn w:val="TableNormal"/>
+    <w:basedOn w:val="a3"/>
     <w:uiPriority w:val="62"/>
     <w:tblPr>
       <w:tblBorders>
@@ -3270,9 +3347,9 @@
       </w:tcPr>
     </w:tblStylePr>
   </w:style>
-  <w:style w:type="table" w:styleId="LightGrid-Accent3">
+  <w:style w:type="table" w:styleId="-31">
     <w:name w:val="Light Grid Accent 3"/>
-    <w:basedOn w:val="TableNormal"/>
+    <w:basedOn w:val="a3"/>
     <w:uiPriority w:val="62"/>
     <w:tblPr>
       <w:tblBorders>
@@ -3387,9 +3464,9 @@
       </w:tcPr>
     </w:tblStylePr>
   </w:style>
-  <w:style w:type="table" w:styleId="LightGrid-Accent4">
+  <w:style w:type="table" w:styleId="-41">
     <w:name w:val="Light Grid Accent 4"/>
-    <w:basedOn w:val="TableNormal"/>
+    <w:basedOn w:val="a3"/>
     <w:uiPriority w:val="62"/>
     <w:tblPr>
       <w:tblBorders>
@@ -3504,9 +3581,9 @@
       </w:tcPr>
     </w:tblStylePr>
   </w:style>
-  <w:style w:type="table" w:styleId="LightGrid-Accent5">
+  <w:style w:type="table" w:styleId="-51">
     <w:name w:val="Light Grid Accent 5"/>
-    <w:basedOn w:val="TableNormal"/>
+    <w:basedOn w:val="a3"/>
     <w:uiPriority w:val="62"/>
     <w:tblPr>
       <w:tblBorders>
@@ -3621,9 +3698,9 @@
       </w:tcPr>
     </w:tblStylePr>
   </w:style>
-  <w:style w:type="table" w:styleId="LightGrid-Accent6">
+  <w:style w:type="table" w:styleId="-61">
     <w:name w:val="Light Grid Accent 6"/>
-    <w:basedOn w:val="TableNormal"/>
+    <w:basedOn w:val="a3"/>
     <w:uiPriority w:val="62"/>
     <w:tblPr>
       <w:tblBorders>
@@ -3738,9 +3815,9 @@
       </w:tcPr>
     </w:tblStylePr>
   </w:style>
-  <w:style w:type="table" w:styleId="MediumShading1">
+  <w:style w:type="table" w:styleId="11">
     <w:name w:val="Medium Shading 1"/>
-    <w:basedOn w:val="TableNormal"/>
+    <w:basedOn w:val="a3"/>
     <w:uiPriority w:val="63"/>
     <w:tblPr>
       <w:tblBorders>
@@ -3831,9 +3908,9 @@
       </w:tcPr>
     </w:tblStylePr>
   </w:style>
-  <w:style w:type="table" w:styleId="MediumShading1-Accent1">
+  <w:style w:type="table" w:styleId="1-1">
     <w:name w:val="Medium Shading 1 Accent 1"/>
-    <w:basedOn w:val="TableNormal"/>
+    <w:basedOn w:val="a3"/>
     <w:uiPriority w:val="63"/>
     <w:tblPr>
       <w:tblBorders>
@@ -3924,9 +4001,9 @@
       </w:tcPr>
     </w:tblStylePr>
   </w:style>
-  <w:style w:type="table" w:styleId="MediumShading1-Accent2">
+  <w:style w:type="table" w:styleId="1-2">
     <w:name w:val="Medium Shading 1 Accent 2"/>
-    <w:basedOn w:val="TableNormal"/>
+    <w:basedOn w:val="a3"/>
     <w:uiPriority w:val="63"/>
     <w:tblPr>
       <w:tblBorders>
@@ -4017,9 +4094,9 @@
       </w:tcPr>
     </w:tblStylePr>
   </w:style>
-  <w:style w:type="table" w:styleId="MediumShading1-Accent3">
+  <w:style w:type="table" w:styleId="1-3">
     <w:name w:val="Medium Shading 1 Accent 3"/>
-    <w:basedOn w:val="TableNormal"/>
+    <w:basedOn w:val="a3"/>
     <w:uiPriority w:val="63"/>
     <w:tblPr>
       <w:tblBorders>
@@ -4110,9 +4187,9 @@
       </w:tcPr>
     </w:tblStylePr>
   </w:style>
-  <w:style w:type="table" w:styleId="MediumShading1-Accent4">
+  <w:style w:type="table" w:styleId="1-4">
     <w:name w:val="Medium Shading 1 Accent 4"/>
-    <w:basedOn w:val="TableNormal"/>
+    <w:basedOn w:val="a3"/>
     <w:uiPriority w:val="63"/>
     <w:tblPr>
       <w:tblBorders>
@@ -4203,9 +4280,9 @@
       </w:tcPr>
     </w:tblStylePr>
   </w:style>
-  <w:style w:type="table" w:styleId="MediumShading1-Accent5">
+  <w:style w:type="table" w:styleId="1-5">
     <w:name w:val="Medium Shading 1 Accent 5"/>
-    <w:basedOn w:val="TableNormal"/>
+    <w:basedOn w:val="a3"/>
     <w:uiPriority w:val="63"/>
     <w:tblPr>
       <w:tblBorders>
@@ -4296,9 +4373,9 @@
       </w:tcPr>
     </w:tblStylePr>
   </w:style>
-  <w:style w:type="table" w:styleId="MediumShading1-Accent6">
+  <w:style w:type="table" w:styleId="1-6">
     <w:name w:val="Medium Shading 1 Accent 6"/>
-    <w:basedOn w:val="TableNormal"/>
+    <w:basedOn w:val="a3"/>
     <w:uiPriority w:val="63"/>
     <w:tblPr>
       <w:tblBorders>
@@ -4389,9 +4466,9 @@
       </w:tcPr>
     </w:tblStylePr>
   </w:style>
-  <w:style w:type="table" w:styleId="MediumShading2">
+  <w:style w:type="table" w:styleId="27">
     <w:name w:val="Medium Shading 2"/>
-    <w:basedOn w:val="TableNormal"/>
+    <w:basedOn w:val="a3"/>
     <w:uiPriority w:val="64"/>
     <w:tblPr>
       <w:tblBorders>
@@ -4525,9 +4602,9 @@
       </w:tcPr>
     </w:tblStylePr>
   </w:style>
-  <w:style w:type="table" w:styleId="MediumShading2-Accent1">
+  <w:style w:type="table" w:styleId="2-1">
     <w:name w:val="Medium Shading 2 Accent 1"/>
-    <w:basedOn w:val="TableNormal"/>
+    <w:basedOn w:val="a3"/>
     <w:uiPriority w:val="64"/>
     <w:tblPr>
       <w:tblBorders>
@@ -4661,9 +4738,9 @@
       </w:tcPr>
     </w:tblStylePr>
   </w:style>
-  <w:style w:type="table" w:styleId="MediumShading2-Accent2">
+  <w:style w:type="table" w:styleId="2-2">
     <w:name w:val="Medium Shading 2 Accent 2"/>
-    <w:basedOn w:val="TableNormal"/>
+    <w:basedOn w:val="a3"/>
     <w:uiPriority w:val="64"/>
     <w:tblPr>
       <w:tblBorders>
@@ -4797,9 +4874,9 @@
       </w:tcPr>
     </w:tblStylePr>
   </w:style>
-  <w:style w:type="table" w:styleId="MediumShading2-Accent3">
+  <w:style w:type="table" w:styleId="2-3">
     <w:name w:val="Medium Shading 2 Accent 3"/>
-    <w:basedOn w:val="TableNormal"/>
+    <w:basedOn w:val="a3"/>
     <w:uiPriority w:val="64"/>
     <w:tblPr>
       <w:tblBorders>
@@ -4933,9 +5010,9 @@
       </w:tcPr>
     </w:tblStylePr>
   </w:style>
-  <w:style w:type="table" w:styleId="MediumShading2-Accent4">
+  <w:style w:type="table" w:styleId="2-4">
     <w:name w:val="Medium Shading 2 Accent 4"/>
-    <w:basedOn w:val="TableNormal"/>
+    <w:basedOn w:val="a3"/>
     <w:uiPriority w:val="64"/>
     <w:tblPr>
       <w:tblBorders>
@@ -5069,9 +5146,9 @@
       </w:tcPr>
     </w:tblStylePr>
   </w:style>
-  <w:style w:type="table" w:styleId="MediumShading2-Accent5">
+  <w:style w:type="table" w:styleId="2-5">
     <w:name w:val="Medium Shading 2 Accent 5"/>
-    <w:basedOn w:val="TableNormal"/>
+    <w:basedOn w:val="a3"/>
     <w:uiPriority w:val="64"/>
     <w:tblPr>
       <w:tblBorders>
@@ -5205,9 +5282,9 @@
       </w:tcPr>
     </w:tblStylePr>
   </w:style>
-  <w:style w:type="table" w:styleId="MediumShading2-Accent6">
+  <w:style w:type="table" w:styleId="2-6">
     <w:name w:val="Medium Shading 2 Accent 6"/>
-    <w:basedOn w:val="TableNormal"/>
+    <w:basedOn w:val="a3"/>
     <w:uiPriority w:val="64"/>
     <w:tblPr>
       <w:tblBorders>
@@ -5341,9 +5418,9 @@
       </w:tcPr>
     </w:tblStylePr>
   </w:style>
-  <w:style w:type="table" w:styleId="MediumList1">
+  <w:style w:type="table" w:styleId="12">
     <w:name w:val="Medium List 1"/>
-    <w:basedOn w:val="TableNormal"/>
+    <w:basedOn w:val="a3"/>
     <w:uiPriority w:val="65"/>
     <w:rPr>
       <w:color w:val="000000" w:themeColor="text1"/>
@@ -5412,9 +5489,9 @@
       </w:tcPr>
     </w:tblStylePr>
   </w:style>
-  <w:style w:type="table" w:styleId="MediumList1-Accent1">
+  <w:style w:type="table" w:styleId="1-10">
     <w:name w:val="Medium List 1 Accent 1"/>
-    <w:basedOn w:val="TableNormal"/>
+    <w:basedOn w:val="a3"/>
     <w:uiPriority w:val="65"/>
     <w:rPr>
       <w:color w:val="000000" w:themeColor="text1"/>
@@ -5483,9 +5560,9 @@
       </w:tcPr>
     </w:tblStylePr>
   </w:style>
-  <w:style w:type="table" w:styleId="MediumList1-Accent2">
+  <w:style w:type="table" w:styleId="1-20">
     <w:name w:val="Medium List 1 Accent 2"/>
-    <w:basedOn w:val="TableNormal"/>
+    <w:basedOn w:val="a3"/>
     <w:uiPriority w:val="65"/>
     <w:rPr>
       <w:color w:val="000000" w:themeColor="text1"/>
@@ -5554,9 +5631,9 @@
       </w:tcPr>
     </w:tblStylePr>
   </w:style>
-  <w:style w:type="table" w:styleId="MediumList1-Accent3">
+  <w:style w:type="table" w:styleId="1-30">
     <w:name w:val="Medium List 1 Accent 3"/>
-    <w:basedOn w:val="TableNormal"/>
+    <w:basedOn w:val="a3"/>
     <w:uiPriority w:val="65"/>
     <w:rPr>
       <w:color w:val="000000" w:themeColor="text1"/>
@@ -5625,9 +5702,9 @@
       </w:tcPr>
     </w:tblStylePr>
   </w:style>
-  <w:style w:type="table" w:styleId="MediumList1-Accent4">
+  <w:style w:type="table" w:styleId="1-40">
     <w:name w:val="Medium List 1 Accent 4"/>
-    <w:basedOn w:val="TableNormal"/>
+    <w:basedOn w:val="a3"/>
     <w:uiPriority w:val="65"/>
     <w:rPr>
       <w:color w:val="000000" w:themeColor="text1"/>
@@ -5696,9 +5773,9 @@
       </w:tcPr>
     </w:tblStylePr>
   </w:style>
-  <w:style w:type="table" w:styleId="MediumList1-Accent5">
+  <w:style w:type="table" w:styleId="1-50">
     <w:name w:val="Medium List 1 Accent 5"/>
-    <w:basedOn w:val="TableNormal"/>
+    <w:basedOn w:val="a3"/>
     <w:uiPriority w:val="65"/>
     <w:rPr>
       <w:color w:val="000000" w:themeColor="text1"/>
@@ -5767,9 +5844,9 @@
       </w:tcPr>
     </w:tblStylePr>
   </w:style>
-  <w:style w:type="table" w:styleId="MediumList1-Accent6">
+  <w:style w:type="table" w:styleId="1-60">
     <w:name w:val="Medium List 1 Accent 6"/>
-    <w:basedOn w:val="TableNormal"/>
+    <w:basedOn w:val="a3"/>
     <w:uiPriority w:val="65"/>
     <w:rPr>
       <w:color w:val="000000" w:themeColor="text1"/>
@@ -5838,9 +5915,9 @@
       </w:tcPr>
     </w:tblStylePr>
   </w:style>
-  <w:style w:type="table" w:styleId="MediumList2">
+  <w:style w:type="table" w:styleId="28">
     <w:name w:val="Medium List 2"/>
-    <w:basedOn w:val="TableNormal"/>
+    <w:basedOn w:val="a3"/>
     <w:uiPriority w:val="66"/>
     <w:rPr>
       <w:rFonts w:asciiTheme="majorHAnsi" w:eastAsiaTheme="majorEastAsia" w:hAnsiTheme="majorHAnsi" w:cstheme="majorBidi"/>
@@ -5953,9 +6030,9 @@
       </w:tcPr>
     </w:tblStylePr>
   </w:style>
-  <w:style w:type="table" w:styleId="MediumList2-Accent1">
+  <w:style w:type="table" w:styleId="2-10">
     <w:name w:val="Medium List 2 Accent 1"/>
-    <w:basedOn w:val="TableNormal"/>
+    <w:basedOn w:val="a3"/>
     <w:uiPriority w:val="66"/>
     <w:rPr>
       <w:rFonts w:asciiTheme="majorHAnsi" w:eastAsiaTheme="majorEastAsia" w:hAnsiTheme="majorHAnsi" w:cstheme="majorBidi"/>
@@ -6068,9 +6145,9 @@
       </w:tcPr>
     </w:tblStylePr>
   </w:style>
-  <w:style w:type="table" w:styleId="MediumList2-Accent2">
+  <w:style w:type="table" w:styleId="2-20">
     <w:name w:val="Medium List 2 Accent 2"/>
-    <w:basedOn w:val="TableNormal"/>
+    <w:basedOn w:val="a3"/>
     <w:uiPriority w:val="66"/>
     <w:rPr>
       <w:rFonts w:asciiTheme="majorHAnsi" w:eastAsiaTheme="majorEastAsia" w:hAnsiTheme="majorHAnsi" w:cstheme="majorBidi"/>
@@ -6183,9 +6260,9 @@
       </w:tcPr>
     </w:tblStylePr>
   </w:style>
-  <w:style w:type="table" w:styleId="MediumList2-Accent3">
+  <w:style w:type="table" w:styleId="2-30">
     <w:name w:val="Medium List 2 Accent 3"/>
-    <w:basedOn w:val="TableNormal"/>
+    <w:basedOn w:val="a3"/>
     <w:uiPriority w:val="66"/>
     <w:rPr>
       <w:rFonts w:asciiTheme="majorHAnsi" w:eastAsiaTheme="majorEastAsia" w:hAnsiTheme="majorHAnsi" w:cstheme="majorBidi"/>
@@ -6298,9 +6375,9 @@
       </w:tcPr>
     </w:tblStylePr>
   </w:style>
-  <w:style w:type="table" w:styleId="MediumList2-Accent4">
+  <w:style w:type="table" w:styleId="2-40">
     <w:name w:val="Medium List 2 Accent 4"/>
-    <w:basedOn w:val="TableNormal"/>
+    <w:basedOn w:val="a3"/>
     <w:uiPriority w:val="66"/>
     <w:rPr>
       <w:rFonts w:asciiTheme="majorHAnsi" w:eastAsiaTheme="majorEastAsia" w:hAnsiTheme="majorHAnsi" w:cstheme="majorBidi"/>
@@ -6413,9 +6490,9 @@
       </w:tcPr>
     </w:tblStylePr>
   </w:style>
-  <w:style w:type="table" w:styleId="MediumList2-Accent5">
+  <w:style w:type="table" w:styleId="2-50">
     <w:name w:val="Medium List 2 Accent 5"/>
-    <w:basedOn w:val="TableNormal"/>
+    <w:basedOn w:val="a3"/>
     <w:uiPriority w:val="66"/>
     <w:rPr>
       <w:rFonts w:asciiTheme="majorHAnsi" w:eastAsiaTheme="majorEastAsia" w:hAnsiTheme="majorHAnsi" w:cstheme="majorBidi"/>
@@ -6528,9 +6605,9 @@
       </w:tcPr>
     </w:tblStylePr>
   </w:style>
-  <w:style w:type="table" w:styleId="MediumList2-Accent6">
+  <w:style w:type="table" w:styleId="2-60">
     <w:name w:val="Medium List 2 Accent 6"/>
-    <w:basedOn w:val="TableNormal"/>
+    <w:basedOn w:val="a3"/>
     <w:uiPriority w:val="66"/>
     <w:rPr>
       <w:rFonts w:asciiTheme="majorHAnsi" w:eastAsiaTheme="majorEastAsia" w:hAnsiTheme="majorHAnsi" w:cstheme="majorBidi"/>
@@ -6643,9 +6720,9 @@
       </w:tcPr>
     </w:tblStylePr>
   </w:style>
-  <w:style w:type="table" w:styleId="MediumGrid1">
+  <w:style w:type="table" w:styleId="13">
     <w:name w:val="Medium Grid 1"/>
-    <w:basedOn w:val="TableNormal"/>
+    <w:basedOn w:val="a3"/>
     <w:uiPriority w:val="67"/>
     <w:tblPr>
       <w:tblBorders>
@@ -6703,9 +6780,9 @@
       </w:tcPr>
     </w:tblStylePr>
   </w:style>
-  <w:style w:type="table" w:styleId="MediumGrid1-Accent1">
+  <w:style w:type="table" w:styleId="1-11">
     <w:name w:val="Medium Grid 1 Accent 1"/>
-    <w:basedOn w:val="TableNormal"/>
+    <w:basedOn w:val="a3"/>
     <w:uiPriority w:val="67"/>
     <w:tblPr>
       <w:tblBorders>
@@ -6763,9 +6840,9 @@
       </w:tcPr>
     </w:tblStylePr>
   </w:style>
-  <w:style w:type="table" w:styleId="MediumGrid1-Accent2">
+  <w:style w:type="table" w:styleId="1-21">
     <w:name w:val="Medium Grid 1 Accent 2"/>
-    <w:basedOn w:val="TableNormal"/>
+    <w:basedOn w:val="a3"/>
     <w:uiPriority w:val="67"/>
     <w:tblPr>
       <w:tblBorders>
@@ -6823,9 +6900,9 @@
       </w:tcPr>
     </w:tblStylePr>
   </w:style>
-  <w:style w:type="table" w:styleId="MediumGrid1-Accent3">
+  <w:style w:type="table" w:styleId="1-31">
     <w:name w:val="Medium Grid 1 Accent 3"/>
-    <w:basedOn w:val="TableNormal"/>
+    <w:basedOn w:val="a3"/>
     <w:uiPriority w:val="67"/>
     <w:tblPr>
       <w:tblBorders>
@@ -6883,9 +6960,9 @@
       </w:tcPr>
     </w:tblStylePr>
   </w:style>
-  <w:style w:type="table" w:styleId="MediumGrid1-Accent4">
+  <w:style w:type="table" w:styleId="1-41">
     <w:name w:val="Medium Grid 1 Accent 4"/>
-    <w:basedOn w:val="TableNormal"/>
+    <w:basedOn w:val="a3"/>
     <w:uiPriority w:val="67"/>
     <w:tblPr>
       <w:tblBorders>
@@ -6943,9 +7020,9 @@
       </w:tcPr>
     </w:tblStylePr>
   </w:style>
-  <w:style w:type="table" w:styleId="MediumGrid1-Accent5">
+  <w:style w:type="table" w:styleId="1-51">
     <w:name w:val="Medium Grid 1 Accent 5"/>
-    <w:basedOn w:val="TableNormal"/>
+    <w:basedOn w:val="a3"/>
     <w:uiPriority w:val="67"/>
     <w:tblPr>
       <w:tblBorders>
@@ -7003,9 +7080,9 @@
       </w:tcPr>
     </w:tblStylePr>
   </w:style>
-  <w:style w:type="table" w:styleId="MediumGrid1-Accent6">
+  <w:style w:type="table" w:styleId="1-61">
     <w:name w:val="Medium Grid 1 Accent 6"/>
-    <w:basedOn w:val="TableNormal"/>
+    <w:basedOn w:val="a3"/>
     <w:uiPriority w:val="67"/>
     <w:tblPr>
       <w:tblBorders>
@@ -7063,9 +7140,9 @@
       </w:tcPr>
     </w:tblStylePr>
   </w:style>
-  <w:style w:type="table" w:styleId="MediumGrid2">
+  <w:style w:type="table" w:styleId="29">
     <w:name w:val="Medium Grid 2"/>
-    <w:basedOn w:val="TableNormal"/>
+    <w:basedOn w:val="a3"/>
     <w:uiPriority w:val="68"/>
     <w:rPr>
       <w:rFonts w:asciiTheme="majorHAnsi" w:eastAsiaTheme="majorEastAsia" w:hAnsiTheme="majorHAnsi" w:cstheme="majorBidi"/>
@@ -7175,9 +7252,9 @@
       </w:tcPr>
     </w:tblStylePr>
   </w:style>
-  <w:style w:type="table" w:styleId="MediumGrid2-Accent1">
+  <w:style w:type="table" w:styleId="2-11">
     <w:name w:val="Medium Grid 2 Accent 1"/>
-    <w:basedOn w:val="TableNormal"/>
+    <w:basedOn w:val="a3"/>
     <w:uiPriority w:val="68"/>
     <w:rPr>
       <w:rFonts w:asciiTheme="majorHAnsi" w:eastAsiaTheme="majorEastAsia" w:hAnsiTheme="majorHAnsi" w:cstheme="majorBidi"/>
@@ -7287,9 +7364,9 @@
       </w:tcPr>
     </w:tblStylePr>
   </w:style>
-  <w:style w:type="table" w:styleId="MediumGrid2-Accent2">
+  <w:style w:type="table" w:styleId="2-21">
     <w:name w:val="Medium Grid 2 Accent 2"/>
-    <w:basedOn w:val="TableNormal"/>
+    <w:basedOn w:val="a3"/>
     <w:uiPriority w:val="68"/>
     <w:rPr>
       <w:rFonts w:asciiTheme="majorHAnsi" w:eastAsiaTheme="majorEastAsia" w:hAnsiTheme="majorHAnsi" w:cstheme="majorBidi"/>
@@ -7399,9 +7476,9 @@
       </w:tcPr>
     </w:tblStylePr>
   </w:style>
-  <w:style w:type="table" w:styleId="MediumGrid2-Accent3">
+  <w:style w:type="table" w:styleId="2-31">
     <w:name w:val="Medium Grid 2 Accent 3"/>
-    <w:basedOn w:val="TableNormal"/>
+    <w:basedOn w:val="a3"/>
     <w:uiPriority w:val="68"/>
     <w:rPr>
       <w:rFonts w:asciiTheme="majorHAnsi" w:eastAsiaTheme="majorEastAsia" w:hAnsiTheme="majorHAnsi" w:cstheme="majorBidi"/>
@@ -7511,9 +7588,9 @@
       </w:tcPr>
     </w:tblStylePr>
   </w:style>
-  <w:style w:type="table" w:styleId="MediumGrid2-Accent4">
+  <w:style w:type="table" w:styleId="2-41">
     <w:name w:val="Medium Grid 2 Accent 4"/>
-    <w:basedOn w:val="TableNormal"/>
+    <w:basedOn w:val="a3"/>
     <w:uiPriority w:val="68"/>
     <w:rPr>
       <w:rFonts w:asciiTheme="majorHAnsi" w:eastAsiaTheme="majorEastAsia" w:hAnsiTheme="majorHAnsi" w:cstheme="majorBidi"/>
@@ -7623,9 +7700,9 @@
       </w:tcPr>
     </w:tblStylePr>
   </w:style>
-  <w:style w:type="table" w:styleId="MediumGrid2-Accent5">
+  <w:style w:type="table" w:styleId="2-51">
     <w:name w:val="Medium Grid 2 Accent 5"/>
-    <w:basedOn w:val="TableNormal"/>
+    <w:basedOn w:val="a3"/>
     <w:uiPriority w:val="68"/>
     <w:rPr>
       <w:rFonts w:asciiTheme="majorHAnsi" w:eastAsiaTheme="majorEastAsia" w:hAnsiTheme="majorHAnsi" w:cstheme="majorBidi"/>
@@ -7735,9 +7812,9 @@
       </w:tcPr>
     </w:tblStylePr>
   </w:style>
-  <w:style w:type="table" w:styleId="MediumGrid2-Accent6">
+  <w:style w:type="table" w:styleId="2-61">
     <w:name w:val="Medium Grid 2 Accent 6"/>
-    <w:basedOn w:val="TableNormal"/>
+    <w:basedOn w:val="a3"/>
     <w:uiPriority w:val="68"/>
     <w:rPr>
       <w:rFonts w:asciiTheme="majorHAnsi" w:eastAsiaTheme="majorEastAsia" w:hAnsiTheme="majorHAnsi" w:cstheme="majorBidi"/>
@@ -7847,9 +7924,9 @@
       </w:tcPr>
     </w:tblStylePr>
   </w:style>
-  <w:style w:type="table" w:styleId="MediumGrid3">
+  <w:style w:type="table" w:styleId="37">
     <w:name w:val="Medium Grid 3"/>
-    <w:basedOn w:val="TableNormal"/>
+    <w:basedOn w:val="a3"/>
     <w:uiPriority w:val="69"/>
     <w:tblPr>
       <w:tblBorders>
@@ -7975,9 +8052,9 @@
       </w:tcPr>
     </w:tblStylePr>
   </w:style>
-  <w:style w:type="table" w:styleId="MediumGrid3-Accent1">
+  <w:style w:type="table" w:styleId="3-1">
     <w:name w:val="Medium Grid 3 Accent 1"/>
-    <w:basedOn w:val="TableNormal"/>
+    <w:basedOn w:val="a3"/>
     <w:uiPriority w:val="69"/>
     <w:tblPr>
       <w:tblBorders>
@@ -8103,9 +8180,9 @@
       </w:tcPr>
     </w:tblStylePr>
   </w:style>
-  <w:style w:type="table" w:styleId="MediumGrid3-Accent2">
+  <w:style w:type="table" w:styleId="3-2">
     <w:name w:val="Medium Grid 3 Accent 2"/>
-    <w:basedOn w:val="TableNormal"/>
+    <w:basedOn w:val="a3"/>
     <w:uiPriority w:val="69"/>
     <w:tblPr>
       <w:tblBorders>
@@ -8231,9 +8308,9 @@
       </w:tcPr>
     </w:tblStylePr>
   </w:style>
-  <w:style w:type="table" w:styleId="MediumGrid3-Accent3">
+  <w:style w:type="table" w:styleId="3-3">
     <w:name w:val="Medium Grid 3 Accent 3"/>
-    <w:basedOn w:val="TableNormal"/>
+    <w:basedOn w:val="a3"/>
     <w:uiPriority w:val="69"/>
     <w:tblPr>
       <w:tblBorders>
@@ -8359,9 +8436,9 @@
       </w:tcPr>
     </w:tblStylePr>
   </w:style>
-  <w:style w:type="table" w:styleId="MediumGrid3-Accent4">
+  <w:style w:type="table" w:styleId="3-4">
     <w:name w:val="Medium Grid 3 Accent 4"/>
-    <w:basedOn w:val="TableNormal"/>
+    <w:basedOn w:val="a3"/>
     <w:uiPriority w:val="69"/>
     <w:tblPr>
       <w:tblBorders>
@@ -8487,9 +8564,9 @@
       </w:tcPr>
     </w:tblStylePr>
   </w:style>
-  <w:style w:type="table" w:styleId="MediumGrid3-Accent5">
+  <w:style w:type="table" w:styleId="3-5">
     <w:name w:val="Medium Grid 3 Accent 5"/>
-    <w:basedOn w:val="TableNormal"/>
+    <w:basedOn w:val="a3"/>
     <w:uiPriority w:val="69"/>
     <w:tblPr>
       <w:tblBorders>
@@ -8615,9 +8692,9 @@
       </w:tcPr>
     </w:tblStylePr>
   </w:style>
-  <w:style w:type="table" w:styleId="MediumGrid3-Accent6">
+  <w:style w:type="table" w:styleId="3-6">
     <w:name w:val="Medium Grid 3 Accent 6"/>
-    <w:basedOn w:val="TableNormal"/>
+    <w:basedOn w:val="a3"/>
     <w:uiPriority w:val="69"/>
     <w:tblPr>
       <w:tblBorders>
@@ -8743,9 +8820,9 @@
       </w:tcPr>
     </w:tblStylePr>
   </w:style>
-  <w:style w:type="table" w:styleId="DarkList">
+  <w:style w:type="table" w:styleId="af8">
     <w:name w:val="Dark List"/>
-    <w:basedOn w:val="TableNormal"/>
+    <w:basedOn w:val="a3"/>
     <w:uiPriority w:val="70"/>
     <w:rPr>
       <w:color w:val="FFFFFF" w:themeColor="background1"/>
@@ -8843,9 +8920,9 @@
       </w:tcPr>
     </w:tblStylePr>
   </w:style>
-  <w:style w:type="table" w:styleId="DarkList-Accent1">
+  <w:style w:type="table" w:styleId="-12">
     <w:name w:val="Dark List Accent 1"/>
-    <w:basedOn w:val="TableNormal"/>
+    <w:basedOn w:val="a3"/>
     <w:uiPriority w:val="70"/>
     <w:rPr>
       <w:color w:val="FFFFFF" w:themeColor="background1"/>
@@ -8943,9 +9020,9 @@
       </w:tcPr>
     </w:tblStylePr>
   </w:style>
-  <w:style w:type="table" w:styleId="DarkList-Accent2">
+  <w:style w:type="table" w:styleId="-22">
     <w:name w:val="Dark List Accent 2"/>
-    <w:basedOn w:val="TableNormal"/>
+    <w:basedOn w:val="a3"/>
     <w:uiPriority w:val="70"/>
     <w:rPr>
       <w:color w:val="FFFFFF" w:themeColor="background1"/>
@@ -9043,9 +9120,9 @@
       </w:tcPr>
     </w:tblStylePr>
   </w:style>
-  <w:style w:type="table" w:styleId="DarkList-Accent3">
+  <w:style w:type="table" w:styleId="-32">
     <w:name w:val="Dark List Accent 3"/>
-    <w:basedOn w:val="TableNormal"/>
+    <w:basedOn w:val="a3"/>
     <w:uiPriority w:val="70"/>
     <w:rPr>
       <w:color w:val="FFFFFF" w:themeColor="background1"/>
@@ -9143,9 +9220,9 @@
       </w:tcPr>
     </w:tblStylePr>
   </w:style>
-  <w:style w:type="table" w:styleId="DarkList-Accent4">
+  <w:style w:type="table" w:styleId="-42">
     <w:name w:val="Dark List Accent 4"/>
-    <w:basedOn w:val="TableNormal"/>
+    <w:basedOn w:val="a3"/>
     <w:uiPriority w:val="70"/>
     <w:rPr>
       <w:color w:val="FFFFFF" w:themeColor="background1"/>
@@ -9243,9 +9320,9 @@
       </w:tcPr>
     </w:tblStylePr>
   </w:style>
-  <w:style w:type="table" w:styleId="DarkList-Accent5">
+  <w:style w:type="table" w:styleId="-52">
     <w:name w:val="Dark List Accent 5"/>
-    <w:basedOn w:val="TableNormal"/>
+    <w:basedOn w:val="a3"/>
     <w:uiPriority w:val="70"/>
     <w:rPr>
       <w:color w:val="FFFFFF" w:themeColor="background1"/>
@@ -9343,9 +9420,9 @@
       </w:tcPr>
     </w:tblStylePr>
   </w:style>
-  <w:style w:type="table" w:styleId="DarkList-Accent6">
+  <w:style w:type="table" w:styleId="-62">
     <w:name w:val="Dark List Accent 6"/>
-    <w:basedOn w:val="TableNormal"/>
+    <w:basedOn w:val="a3"/>
     <w:uiPriority w:val="70"/>
     <w:rPr>
       <w:color w:val="FFFFFF" w:themeColor="background1"/>
@@ -9443,9 +9520,9 @@
       </w:tcPr>
     </w:tblStylePr>
   </w:style>
-  <w:style w:type="table" w:styleId="ColorfulShading">
+  <w:style w:type="table" w:styleId="af9">
     <w:name w:val="Colorful Shading"/>
-    <w:basedOn w:val="TableNormal"/>
+    <w:basedOn w:val="a3"/>
     <w:uiPriority w:val="71"/>
     <w:rPr>
       <w:color w:val="000000" w:themeColor="text1"/>
@@ -9552,9 +9629,9 @@
       </w:rPr>
     </w:tblStylePr>
   </w:style>
-  <w:style w:type="table" w:styleId="ColorfulShading-Accent1">
+  <w:style w:type="table" w:styleId="-13">
     <w:name w:val="Colorful Shading Accent 1"/>
-    <w:basedOn w:val="TableNormal"/>
+    <w:basedOn w:val="a3"/>
     <w:uiPriority w:val="71"/>
     <w:rPr>
       <w:color w:val="000000" w:themeColor="text1"/>
@@ -9661,9 +9738,9 @@
       </w:rPr>
     </w:tblStylePr>
   </w:style>
-  <w:style w:type="table" w:styleId="ColorfulShading-Accent2">
+  <w:style w:type="table" w:styleId="-23">
     <w:name w:val="Colorful Shading Accent 2"/>
-    <w:basedOn w:val="TableNormal"/>
+    <w:basedOn w:val="a3"/>
     <w:uiPriority w:val="71"/>
     <w:rPr>
       <w:color w:val="000000" w:themeColor="text1"/>
@@ -9770,9 +9847,9 @@
       </w:rPr>
     </w:tblStylePr>
   </w:style>
-  <w:style w:type="table" w:styleId="ColorfulShading-Accent3">
+  <w:style w:type="table" w:styleId="-33">
     <w:name w:val="Colorful Shading Accent 3"/>
-    <w:basedOn w:val="TableNormal"/>
+    <w:basedOn w:val="a3"/>
     <w:uiPriority w:val="71"/>
     <w:rPr>
       <w:color w:val="000000" w:themeColor="text1"/>
@@ -9869,9 +9946,9 @@
       </w:tcPr>
     </w:tblStylePr>
   </w:style>
-  <w:style w:type="table" w:styleId="ColorfulShading-Accent4">
+  <w:style w:type="table" w:styleId="-43">
     <w:name w:val="Colorful Shading Accent 4"/>
-    <w:basedOn w:val="TableNormal"/>
+    <w:basedOn w:val="a3"/>
     <w:uiPriority w:val="71"/>
     <w:rPr>
       <w:color w:val="000000" w:themeColor="text1"/>
@@ -9978,9 +10055,9 @@
       </w:rPr>
     </w:tblStylePr>
   </w:style>
-  <w:style w:type="table" w:styleId="ColorfulShading-Accent5">
+  <w:style w:type="table" w:styleId="-53">
     <w:name w:val="Colorful Shading Accent 5"/>
-    <w:basedOn w:val="TableNormal"/>
+    <w:basedOn w:val="a3"/>
     <w:uiPriority w:val="71"/>
     <w:rPr>
       <w:color w:val="000000" w:themeColor="text1"/>
@@ -10087,9 +10164,9 @@
       </w:rPr>
     </w:tblStylePr>
   </w:style>
-  <w:style w:type="table" w:styleId="ColorfulShading-Accent6">
+  <w:style w:type="table" w:styleId="-63">
     <w:name w:val="Colorful Shading Accent 6"/>
-    <w:basedOn w:val="TableNormal"/>
+    <w:basedOn w:val="a3"/>
     <w:uiPriority w:val="71"/>
     <w:rPr>
       <w:color w:val="000000" w:themeColor="text1"/>
@@ -10196,9 +10273,9 @@
       </w:rPr>
     </w:tblStylePr>
   </w:style>
-  <w:style w:type="table" w:styleId="ColorfulList">
+  <w:style w:type="table" w:styleId="afa">
     <w:name w:val="Colorful List"/>
-    <w:basedOn w:val="TableNormal"/>
+    <w:basedOn w:val="a3"/>
     <w:uiPriority w:val="72"/>
     <w:rPr>
       <w:color w:val="000000" w:themeColor="text1"/>
@@ -10268,9 +10345,9 @@
       </w:tcPr>
     </w:tblStylePr>
   </w:style>
-  <w:style w:type="table" w:styleId="ColorfulList-Accent1">
+  <w:style w:type="table" w:styleId="-14">
     <w:name w:val="Colorful List Accent 1"/>
-    <w:basedOn w:val="TableNormal"/>
+    <w:basedOn w:val="a3"/>
     <w:uiPriority w:val="72"/>
     <w:rPr>
       <w:color w:val="000000" w:themeColor="text1"/>
@@ -10340,9 +10417,9 @@
       </w:tcPr>
     </w:tblStylePr>
   </w:style>
-  <w:style w:type="table" w:styleId="ColorfulList-Accent2">
+  <w:style w:type="table" w:styleId="-24">
     <w:name w:val="Colorful List Accent 2"/>
-    <w:basedOn w:val="TableNormal"/>
+    <w:basedOn w:val="a3"/>
     <w:uiPriority w:val="72"/>
     <w:rPr>
       <w:color w:val="000000" w:themeColor="text1"/>
@@ -10412,9 +10489,9 @@
       </w:tcPr>
     </w:tblStylePr>
   </w:style>
-  <w:style w:type="table" w:styleId="ColorfulList-Accent3">
+  <w:style w:type="table" w:styleId="-34">
     <w:name w:val="Colorful List Accent 3"/>
-    <w:basedOn w:val="TableNormal"/>
+    <w:basedOn w:val="a3"/>
     <w:uiPriority w:val="72"/>
     <w:rPr>
       <w:color w:val="000000" w:themeColor="text1"/>
@@ -10484,9 +10561,9 @@
       </w:tcPr>
     </w:tblStylePr>
   </w:style>
-  <w:style w:type="table" w:styleId="ColorfulList-Accent4">
+  <w:style w:type="table" w:styleId="-44">
     <w:name w:val="Colorful List Accent 4"/>
-    <w:basedOn w:val="TableNormal"/>
+    <w:basedOn w:val="a3"/>
     <w:uiPriority w:val="72"/>
     <w:rPr>
       <w:color w:val="000000" w:themeColor="text1"/>
@@ -10556,9 +10633,9 @@
       </w:tcPr>
     </w:tblStylePr>
   </w:style>
-  <w:style w:type="table" w:styleId="ColorfulList-Accent5">
+  <w:style w:type="table" w:styleId="-54">
     <w:name w:val="Colorful List Accent 5"/>
-    <w:basedOn w:val="TableNormal"/>
+    <w:basedOn w:val="a3"/>
     <w:uiPriority w:val="72"/>
     <w:rPr>
       <w:color w:val="000000" w:themeColor="text1"/>
@@ -10628,9 +10705,9 @@
       </w:tcPr>
     </w:tblStylePr>
   </w:style>
-  <w:style w:type="table" w:styleId="ColorfulList-Accent6">
+  <w:style w:type="table" w:styleId="-64">
     <w:name w:val="Colorful List Accent 6"/>
-    <w:basedOn w:val="TableNormal"/>
+    <w:basedOn w:val="a3"/>
     <w:uiPriority w:val="72"/>
     <w:rPr>
       <w:color w:val="000000" w:themeColor="text1"/>
@@ -10700,9 +10777,9 @@
       </w:tcPr>
     </w:tblStylePr>
   </w:style>
-  <w:style w:type="table" w:styleId="ColorfulGrid">
+  <w:style w:type="table" w:styleId="afb">
     <w:name w:val="Colorful Grid"/>
-    <w:basedOn w:val="TableNormal"/>
+    <w:basedOn w:val="a3"/>
     <w:uiPriority w:val="73"/>
     <w:rPr>
       <w:color w:val="000000" w:themeColor="text1"/>
@@ -10767,9 +10844,9 @@
       </w:tcPr>
     </w:tblStylePr>
   </w:style>
-  <w:style w:type="table" w:styleId="ColorfulGrid-Accent1">
+  <w:style w:type="table" w:styleId="-15">
     <w:name w:val="Colorful Grid Accent 1"/>
-    <w:basedOn w:val="TableNormal"/>
+    <w:basedOn w:val="a3"/>
     <w:uiPriority w:val="73"/>
     <w:rPr>
       <w:color w:val="000000" w:themeColor="text1"/>
@@ -10834,9 +10911,9 @@
       </w:tcPr>
     </w:tblStylePr>
   </w:style>
-  <w:style w:type="table" w:styleId="ColorfulGrid-Accent2">
+  <w:style w:type="table" w:styleId="-25">
     <w:name w:val="Colorful Grid Accent 2"/>
-    <w:basedOn w:val="TableNormal"/>
+    <w:basedOn w:val="a3"/>
     <w:uiPriority w:val="73"/>
     <w:rPr>
       <w:color w:val="000000" w:themeColor="text1"/>
@@ -10901,9 +10978,9 @@
       </w:tcPr>
     </w:tblStylePr>
   </w:style>
-  <w:style w:type="table" w:styleId="ColorfulGrid-Accent3">
+  <w:style w:type="table" w:styleId="-35">
     <w:name w:val="Colorful Grid Accent 3"/>
-    <w:basedOn w:val="TableNormal"/>
+    <w:basedOn w:val="a3"/>
     <w:uiPriority w:val="73"/>
     <w:rPr>
       <w:color w:val="000000" w:themeColor="text1"/>
@@ -10968,9 +11045,9 @@
       </w:tcPr>
     </w:tblStylePr>
   </w:style>
-  <w:style w:type="table" w:styleId="ColorfulGrid-Accent4">
+  <w:style w:type="table" w:styleId="-45">
     <w:name w:val="Colorful Grid Accent 4"/>
-    <w:basedOn w:val="TableNormal"/>
+    <w:basedOn w:val="a3"/>
     <w:uiPriority w:val="73"/>
     <w:rPr>
       <w:color w:val="000000" w:themeColor="text1"/>
@@ -11035,9 +11112,9 @@
       </w:tcPr>
     </w:tblStylePr>
   </w:style>
-  <w:style w:type="table" w:styleId="ColorfulGrid-Accent5">
+  <w:style w:type="table" w:styleId="-55">
     <w:name w:val="Colorful Grid Accent 5"/>
-    <w:basedOn w:val="TableNormal"/>
+    <w:basedOn w:val="a3"/>
     <w:uiPriority w:val="73"/>
     <w:rPr>
       <w:color w:val="000000" w:themeColor="text1"/>
@@ -11102,9 +11179,9 @@
       </w:tcPr>
     </w:tblStylePr>
   </w:style>
-  <w:style w:type="table" w:styleId="ColorfulGrid-Accent6">
+  <w:style w:type="table" w:styleId="-65">
     <w:name w:val="Colorful Grid Accent 6"/>
-    <w:basedOn w:val="TableNormal"/>
+    <w:basedOn w:val="a3"/>
     <w:uiPriority w:val="73"/>
     <w:rPr>
       <w:color w:val="000000" w:themeColor="text1"/>
@@ -11169,9 +11246,9 @@
       </w:tcPr>
     </w:tblStylePr>
   </w:style>
-  <w:style w:type="character" w:styleId="Strong">
+  <w:style w:type="character" w:styleId="afc">
     <w:name w:val="Strong"/>
-    <w:basedOn w:val="DefaultParagraphFont"/>
+    <w:basedOn w:val="a2"/>
     <w:uiPriority w:val="22"/>
     <w:qFormat/>
     <w:rPr>
@@ -11179,9 +11256,9 @@
       <w:bCs/>
     </w:rPr>
   </w:style>
-  <w:style w:type="character" w:styleId="Emphasis">
+  <w:style w:type="character" w:styleId="afd">
     <w:name w:val="Emphasis"/>
-    <w:basedOn w:val="DefaultParagraphFont"/>
+    <w:basedOn w:val="a2"/>
     <w:uiPriority w:val="20"/>
     <w:qFormat/>
     <w:rPr>
@@ -11189,19 +11266,19 @@
       <w:iCs/>
     </w:rPr>
   </w:style>
-  <w:style w:type="character" w:customStyle="1" w:styleId="HeaderChar">
-    <w:name w:val="Header Char"/>
-    <w:basedOn w:val="DefaultParagraphFont"/>
-    <w:link w:val="Header"/>
+  <w:style w:type="character" w:customStyle="1" w:styleId="ae">
+    <w:name w:val="页眉 字符"/>
+    <w:basedOn w:val="a2"/>
+    <w:link w:val="ad"/>
     <w:uiPriority w:val="99"/>
   </w:style>
-  <w:style w:type="character" w:customStyle="1" w:styleId="FooterChar">
-    <w:name w:val="Footer Char"/>
-    <w:basedOn w:val="DefaultParagraphFont"/>
-    <w:link w:val="Footer"/>
+  <w:style w:type="character" w:customStyle="1" w:styleId="ac">
+    <w:name w:val="页脚 字符"/>
+    <w:basedOn w:val="a2"/>
+    <w:link w:val="ab"/>
     <w:uiPriority w:val="99"/>
   </w:style>
-  <w:style w:type="paragraph" w:styleId="NoSpacing">
+  <w:style w:type="paragraph" w:styleId="afe">
     <w:name w:val="No Spacing"/>
     <w:uiPriority w:val="1"/>
     <w:qFormat/>
@@ -11211,10 +11288,10 @@
       <w:lang w:val="en-US" w:eastAsia="en-US"/>
     </w:rPr>
   </w:style>
-  <w:style w:type="character" w:customStyle="1" w:styleId="Heading1Char">
-    <w:name w:val="Heading 1 Char"/>
-    <w:basedOn w:val="DefaultParagraphFont"/>
-    <w:link w:val="Heading1"/>
+  <w:style w:type="character" w:customStyle="1" w:styleId="10">
+    <w:name w:val="标题 1 字符"/>
+    <w:basedOn w:val="a2"/>
+    <w:link w:val="1"/>
     <w:uiPriority w:val="9"/>
     <w:rPr>
       <w:rFonts w:asciiTheme="majorHAnsi" w:eastAsiaTheme="majorEastAsia" w:hAnsiTheme="majorHAnsi" w:cstheme="majorBidi"/>
@@ -11225,10 +11302,10 @@
       <w:szCs w:val="28"/>
     </w:rPr>
   </w:style>
-  <w:style w:type="character" w:customStyle="1" w:styleId="Heading2Char">
-    <w:name w:val="Heading 2 Char"/>
-    <w:basedOn w:val="DefaultParagraphFont"/>
-    <w:link w:val="Heading2"/>
+  <w:style w:type="character" w:customStyle="1" w:styleId="22">
+    <w:name w:val="标题 2 字符"/>
+    <w:basedOn w:val="a2"/>
+    <w:link w:val="21"/>
     <w:uiPriority w:val="9"/>
     <w:rPr>
       <w:rFonts w:asciiTheme="majorHAnsi" w:eastAsiaTheme="majorEastAsia" w:hAnsiTheme="majorHAnsi" w:cstheme="majorBidi"/>
@@ -11239,10 +11316,10 @@
       <w:szCs w:val="26"/>
     </w:rPr>
   </w:style>
-  <w:style w:type="character" w:customStyle="1" w:styleId="Heading3Char">
-    <w:name w:val="Heading 3 Char"/>
-    <w:basedOn w:val="DefaultParagraphFont"/>
-    <w:link w:val="Heading3"/>
+  <w:style w:type="character" w:customStyle="1" w:styleId="32">
+    <w:name w:val="标题 3 字符"/>
+    <w:basedOn w:val="a2"/>
+    <w:link w:val="31"/>
     <w:uiPriority w:val="9"/>
     <w:rPr>
       <w:rFonts w:asciiTheme="majorHAnsi" w:eastAsiaTheme="majorEastAsia" w:hAnsiTheme="majorHAnsi" w:cstheme="majorBidi"/>
@@ -11251,10 +11328,10 @@
       <w:color w:val="4F81BD" w:themeColor="accent1"/>
     </w:rPr>
   </w:style>
-  <w:style w:type="character" w:customStyle="1" w:styleId="TitleChar">
-    <w:name w:val="Title Char"/>
-    <w:basedOn w:val="DefaultParagraphFont"/>
-    <w:link w:val="Title"/>
+  <w:style w:type="character" w:customStyle="1" w:styleId="af3">
+    <w:name w:val="标题 字符"/>
+    <w:basedOn w:val="a2"/>
+    <w:link w:val="af2"/>
     <w:uiPriority w:val="10"/>
     <w:rPr>
       <w:rFonts w:asciiTheme="majorHAnsi" w:eastAsiaTheme="majorEastAsia" w:hAnsiTheme="majorHAnsi" w:cstheme="majorBidi"/>
@@ -11265,10 +11342,10 @@
       <w:szCs w:val="52"/>
     </w:rPr>
   </w:style>
-  <w:style w:type="character" w:customStyle="1" w:styleId="SubtitleChar">
-    <w:name w:val="Subtitle Char"/>
-    <w:basedOn w:val="DefaultParagraphFont"/>
-    <w:link w:val="Subtitle"/>
+  <w:style w:type="character" w:customStyle="1" w:styleId="af0">
+    <w:name w:val="副标题 字符"/>
+    <w:basedOn w:val="a2"/>
+    <w:link w:val="af"/>
     <w:uiPriority w:val="11"/>
     <w:rPr>
       <w:rFonts w:asciiTheme="majorHAnsi" w:eastAsiaTheme="majorEastAsia" w:hAnsiTheme="majorHAnsi" w:cstheme="majorBidi"/>
@@ -11280,9 +11357,9 @@
       <w:szCs w:val="24"/>
     </w:rPr>
   </w:style>
-  <w:style w:type="paragraph" w:styleId="ListParagraph">
+  <w:style w:type="paragraph" w:styleId="aff">
     <w:name w:val="List Paragraph"/>
-    <w:basedOn w:val="Normal"/>
+    <w:basedOn w:val="a1"/>
     <w:uiPriority w:val="34"/>
     <w:qFormat/>
     <w:pPr>
@@ -11290,32 +11367,32 @@
       <w:contextualSpacing/>
     </w:pPr>
   </w:style>
-  <w:style w:type="character" w:customStyle="1" w:styleId="BodyTextChar">
-    <w:name w:val="Body Text Char"/>
-    <w:basedOn w:val="DefaultParagraphFont"/>
-    <w:link w:val="BodyText"/>
+  <w:style w:type="character" w:customStyle="1" w:styleId="a9">
+    <w:name w:val="正文文本 字符"/>
+    <w:basedOn w:val="a2"/>
+    <w:link w:val="a8"/>
     <w:uiPriority w:val="99"/>
   </w:style>
-  <w:style w:type="character" w:customStyle="1" w:styleId="BodyText2Char">
-    <w:name w:val="Body Text 2 Char"/>
-    <w:basedOn w:val="DefaultParagraphFont"/>
-    <w:link w:val="BodyText2"/>
+  <w:style w:type="character" w:customStyle="1" w:styleId="25">
+    <w:name w:val="正文文本 2 字符"/>
+    <w:basedOn w:val="a2"/>
+    <w:link w:val="24"/>
     <w:uiPriority w:val="99"/>
   </w:style>
-  <w:style w:type="character" w:customStyle="1" w:styleId="BodyText3Char">
-    <w:name w:val="Body Text 3 Char"/>
-    <w:basedOn w:val="DefaultParagraphFont"/>
-    <w:link w:val="BodyText3"/>
+  <w:style w:type="character" w:customStyle="1" w:styleId="35">
+    <w:name w:val="正文文本 3 字符"/>
+    <w:basedOn w:val="a2"/>
+    <w:link w:val="34"/>
     <w:uiPriority w:val="99"/>
     <w:rPr>
       <w:sz w:val="16"/>
       <w:szCs w:val="16"/>
     </w:rPr>
   </w:style>
-  <w:style w:type="character" w:customStyle="1" w:styleId="MacroTextChar">
-    <w:name w:val="Macro Text Char"/>
-    <w:basedOn w:val="DefaultParagraphFont"/>
-    <w:link w:val="MacroText"/>
+  <w:style w:type="character" w:customStyle="1" w:styleId="a6">
+    <w:name w:val="宏文本 字符"/>
+    <w:basedOn w:val="a2"/>
+    <w:link w:val="a5"/>
     <w:uiPriority w:val="99"/>
     <w:rPr>
       <w:rFonts w:ascii="Courier" w:hAnsi="Courier"/>
@@ -11323,11 +11400,11 @@
       <w:szCs w:val="20"/>
     </w:rPr>
   </w:style>
-  <w:style w:type="paragraph" w:styleId="Quote">
+  <w:style w:type="paragraph" w:styleId="aff0">
     <w:name w:val="Quote"/>
-    <w:basedOn w:val="Normal"/>
-    <w:next w:val="Normal"/>
-    <w:link w:val="QuoteChar"/>
+    <w:basedOn w:val="a1"/>
+    <w:next w:val="a1"/>
+    <w:link w:val="aff1"/>
     <w:uiPriority w:val="29"/>
     <w:qFormat/>
     <w:rPr>
@@ -11336,10 +11413,10 @@
       <w:color w:val="000000" w:themeColor="text1"/>
     </w:rPr>
   </w:style>
-  <w:style w:type="character" w:customStyle="1" w:styleId="QuoteChar">
-    <w:name w:val="Quote Char"/>
-    <w:basedOn w:val="DefaultParagraphFont"/>
-    <w:link w:val="Quote"/>
+  <w:style w:type="character" w:customStyle="1" w:styleId="aff1">
+    <w:name w:val="引用 字符"/>
+    <w:basedOn w:val="a2"/>
+    <w:link w:val="aff0"/>
     <w:uiPriority w:val="29"/>
     <w:rPr>
       <w:i/>
@@ -11347,10 +11424,10 @@
       <w:color w:val="000000" w:themeColor="text1"/>
     </w:rPr>
   </w:style>
-  <w:style w:type="character" w:customStyle="1" w:styleId="Heading4Char">
-    <w:name w:val="Heading 4 Char"/>
-    <w:basedOn w:val="DefaultParagraphFont"/>
-    <w:link w:val="Heading4"/>
+  <w:style w:type="character" w:customStyle="1" w:styleId="40">
+    <w:name w:val="标题 4 字符"/>
+    <w:basedOn w:val="a2"/>
+    <w:link w:val="4"/>
     <w:uiPriority w:val="9"/>
     <w:semiHidden/>
     <w:rPr>
@@ -11362,10 +11439,10 @@
       <w:color w:val="4F81BD" w:themeColor="accent1"/>
     </w:rPr>
   </w:style>
-  <w:style w:type="character" w:customStyle="1" w:styleId="Heading5Char">
-    <w:name w:val="Heading 5 Char"/>
-    <w:basedOn w:val="DefaultParagraphFont"/>
-    <w:link w:val="Heading5"/>
+  <w:style w:type="character" w:customStyle="1" w:styleId="50">
+    <w:name w:val="标题 5 字符"/>
+    <w:basedOn w:val="a2"/>
+    <w:link w:val="5"/>
     <w:uiPriority w:val="9"/>
     <w:semiHidden/>
     <w:rPr>
@@ -11373,10 +11450,10 @@
       <w:color w:val="244061" w:themeColor="accent1" w:themeShade="80"/>
     </w:rPr>
   </w:style>
-  <w:style w:type="character" w:customStyle="1" w:styleId="Heading6Char">
-    <w:name w:val="Heading 6 Char"/>
-    <w:basedOn w:val="DefaultParagraphFont"/>
-    <w:link w:val="Heading6"/>
+  <w:style w:type="character" w:customStyle="1" w:styleId="60">
+    <w:name w:val="标题 6 字符"/>
+    <w:basedOn w:val="a2"/>
+    <w:link w:val="6"/>
     <w:uiPriority w:val="9"/>
     <w:semiHidden/>
     <w:rPr>
@@ -11386,10 +11463,10 @@
       <w:color w:val="244061" w:themeColor="accent1" w:themeShade="80"/>
     </w:rPr>
   </w:style>
-  <w:style w:type="character" w:customStyle="1" w:styleId="Heading7Char">
-    <w:name w:val="Heading 7 Char"/>
-    <w:basedOn w:val="DefaultParagraphFont"/>
-    <w:link w:val="Heading7"/>
+  <w:style w:type="character" w:customStyle="1" w:styleId="70">
+    <w:name w:val="标题 7 字符"/>
+    <w:basedOn w:val="a2"/>
+    <w:link w:val="7"/>
     <w:uiPriority w:val="9"/>
     <w:semiHidden/>
     <w:rPr>
@@ -11399,10 +11476,10 @@
       <w:color w:val="404040" w:themeColor="text1" w:themeTint="BF"/>
     </w:rPr>
   </w:style>
-  <w:style w:type="character" w:customStyle="1" w:styleId="Heading8Char">
-    <w:name w:val="Heading 8 Char"/>
-    <w:basedOn w:val="DefaultParagraphFont"/>
-    <w:link w:val="Heading8"/>
+  <w:style w:type="character" w:customStyle="1" w:styleId="80">
+    <w:name w:val="标题 8 字符"/>
+    <w:basedOn w:val="a2"/>
+    <w:link w:val="8"/>
     <w:uiPriority w:val="9"/>
     <w:semiHidden/>
     <w:rPr>
@@ -11412,10 +11489,10 @@
       <w:szCs w:val="20"/>
     </w:rPr>
   </w:style>
-  <w:style w:type="character" w:customStyle="1" w:styleId="Heading9Char">
-    <w:name w:val="Heading 9 Char"/>
-    <w:basedOn w:val="DefaultParagraphFont"/>
-    <w:link w:val="Heading9"/>
+  <w:style w:type="character" w:customStyle="1" w:styleId="90">
+    <w:name w:val="标题 9 字符"/>
+    <w:basedOn w:val="a2"/>
+    <w:link w:val="9"/>
     <w:uiPriority w:val="9"/>
     <w:semiHidden/>
     <w:rPr>
@@ -11427,11 +11504,11 @@
       <w:szCs w:val="20"/>
     </w:rPr>
   </w:style>
-  <w:style w:type="paragraph" w:styleId="IntenseQuote">
+  <w:style w:type="paragraph" w:styleId="aff2">
     <w:name w:val="Intense Quote"/>
-    <w:basedOn w:val="Normal"/>
-    <w:next w:val="Normal"/>
-    <w:link w:val="IntenseQuoteChar"/>
+    <w:basedOn w:val="a1"/>
+    <w:next w:val="a1"/>
+    <w:link w:val="aff3"/>
     <w:uiPriority w:val="30"/>
     <w:qFormat/>
     <w:pPr>
@@ -11449,10 +11526,10 @@
       <w:color w:val="4F81BD" w:themeColor="accent1"/>
     </w:rPr>
   </w:style>
-  <w:style w:type="character" w:customStyle="1" w:styleId="IntenseQuoteChar">
-    <w:name w:val="Intense Quote Char"/>
-    <w:basedOn w:val="DefaultParagraphFont"/>
-    <w:link w:val="IntenseQuote"/>
+  <w:style w:type="character" w:customStyle="1" w:styleId="aff3">
+    <w:name w:val="明显引用 字符"/>
+    <w:basedOn w:val="a2"/>
+    <w:link w:val="aff2"/>
     <w:uiPriority w:val="30"/>
     <w:rPr>
       <w:b/>
@@ -11464,7 +11541,7 @@
   </w:style>
   <w:style w:type="character" w:customStyle="1" w:styleId="SubtleEmphasis1">
     <w:name w:val="Subtle Emphasis1"/>
-    <w:basedOn w:val="DefaultParagraphFont"/>
+    <w:basedOn w:val="a2"/>
     <w:uiPriority w:val="19"/>
     <w:qFormat/>
     <w:rPr>
@@ -11475,7 +11552,7 @@
   </w:style>
   <w:style w:type="character" w:customStyle="1" w:styleId="IntenseEmphasis1">
     <w:name w:val="Intense Emphasis1"/>
-    <w:basedOn w:val="DefaultParagraphFont"/>
+    <w:basedOn w:val="a2"/>
     <w:uiPriority w:val="21"/>
     <w:qFormat/>
     <w:rPr>
@@ -11488,7 +11565,7 @@
   </w:style>
   <w:style w:type="character" w:customStyle="1" w:styleId="SubtleReference1">
     <w:name w:val="Subtle Reference1"/>
-    <w:basedOn w:val="DefaultParagraphFont"/>
+    <w:basedOn w:val="a2"/>
     <w:uiPriority w:val="31"/>
     <w:qFormat/>
     <w:rPr>
@@ -11499,7 +11576,7 @@
   </w:style>
   <w:style w:type="character" w:customStyle="1" w:styleId="IntenseReference1">
     <w:name w:val="Intense Reference1"/>
-    <w:basedOn w:val="DefaultParagraphFont"/>
+    <w:basedOn w:val="a2"/>
     <w:uiPriority w:val="32"/>
     <w:qFormat/>
     <w:rPr>
@@ -11513,7 +11590,7 @@
   </w:style>
   <w:style w:type="character" w:customStyle="1" w:styleId="BookTitle1">
     <w:name w:val="Book Title1"/>
-    <w:basedOn w:val="DefaultParagraphFont"/>
+    <w:basedOn w:val="a2"/>
     <w:uiPriority w:val="33"/>
     <w:qFormat/>
     <w:rPr>
@@ -11525,8 +11602,8 @@
   </w:style>
   <w:style w:type="paragraph" w:customStyle="1" w:styleId="TOCHeading1">
     <w:name w:val="TOC Heading1"/>
-    <w:basedOn w:val="Heading1"/>
-    <w:next w:val="Normal"/>
+    <w:basedOn w:val="1"/>
+    <w:next w:val="a1"/>
     <w:uiPriority w:val="39"/>
     <w:semiHidden/>
     <w:unhideWhenUsed/>

</xml_diff>